<commit_message>
docs: enrich BACSE291 report with visual system flowcharts and physical setup photos
</commit_message>
<xml_diff>
--- a/BACSE291_ENHANCED_IDP_PROGRESS_REPORT_AND_FUTURE_PLAN.docx
+++ b/BACSE291_ENHANCED_IDP_PROGRESS_REPORT_AND_FUTURE_PLAN.docx
@@ -823,6 +823,114 @@
     </w:p>
     <w:p>
       <w:pPr>
+        <w:spacing w:after="40"/>
+        <w:jc w:val="center"/>
+      </w:pPr>
+      <w:r>
+        <w:drawing>
+          <wp:inline xmlns:a="http://schemas.openxmlformats.org/drawingml/2006/main" xmlns:pic="http://schemas.openxmlformats.org/drawingml/2006/picture">
+            <wp:extent cx="4114800" cy="4114800"/>
+            <wp:docPr id="3" name="Picture 3"/>
+            <wp:cNvGraphicFramePr>
+              <a:graphicFrameLocks noChangeAspect="1"/>
+            </wp:cNvGraphicFramePr>
+            <a:graphic>
+              <a:graphicData uri="http://schemas.openxmlformats.org/drawingml/2006/picture">
+                <pic:pic>
+                  <pic:nvPicPr>
+                    <pic:cNvPr id="0" name="physical_scan_bench_1.jpg"/>
+                    <pic:cNvPicPr/>
+                  </pic:nvPicPr>
+                  <pic:blipFill>
+                    <a:blip r:embed="rId11"/>
+                    <a:stretch>
+                      <a:fillRect/>
+                    </a:stretch>
+                  </pic:blipFill>
+                  <pic:spPr>
+                    <a:xfrm>
+                      <a:off x="0" y="0"/>
+                      <a:ext cx="4114800" cy="4114800"/>
+                    </a:xfrm>
+                    <a:prstGeom prst="rect"/>
+                  </pic:spPr>
+                </pic:pic>
+              </a:graphicData>
+            </a:graphic>
+          </wp:inline>
+        </w:drawing>
+      </w:r>
+    </w:p>
+    <w:p>
+      <w:pPr>
+        <w:spacing w:after="160"/>
+        <w:jc w:val="center"/>
+      </w:pPr>
+      <w:r>
+        <w:rPr>
+          <w:i/>
+          <w:color w:val="64748B"/>
+          <w:sz w:val="17"/>
+        </w:rPr>
+        <w:t>Figure 4(a): Physical Sensor Bench Testbed &amp; Measuring Tape Alignment</w:t>
+      </w:r>
+    </w:p>
+    <w:p>
+      <w:pPr>
+        <w:spacing w:after="40"/>
+        <w:jc w:val="center"/>
+      </w:pPr>
+      <w:r>
+        <w:drawing>
+          <wp:inline xmlns:a="http://schemas.openxmlformats.org/drawingml/2006/main" xmlns:pic="http://schemas.openxmlformats.org/drawingml/2006/picture">
+            <wp:extent cx="5486400" cy="2228850"/>
+            <wp:docPr id="4" name="Picture 4"/>
+            <wp:cNvGraphicFramePr>
+              <a:graphicFrameLocks noChangeAspect="1"/>
+            </wp:cNvGraphicFramePr>
+            <a:graphic>
+              <a:graphicData uri="http://schemas.openxmlformats.org/drawingml/2006/picture">
+                <pic:pic>
+                  <pic:nvPicPr>
+                    <pic:cNvPr id="0" name="pptx2_ground_s8_img2.jpg"/>
+                    <pic:cNvPicPr/>
+                  </pic:nvPicPr>
+                  <pic:blipFill>
+                    <a:blip r:embed="rId12"/>
+                    <a:stretch>
+                      <a:fillRect/>
+                    </a:stretch>
+                  </pic:blipFill>
+                  <pic:spPr>
+                    <a:xfrm>
+                      <a:off x="0" y="0"/>
+                      <a:ext cx="5486400" cy="2228850"/>
+                    </a:xfrm>
+                    <a:prstGeom prst="rect"/>
+                  </pic:spPr>
+                </pic:pic>
+              </a:graphicData>
+            </a:graphic>
+          </wp:inline>
+        </w:drawing>
+      </w:r>
+    </w:p>
+    <w:p>
+      <w:pPr>
+        <w:spacing w:after="160"/>
+        <w:jc w:val="center"/>
+      </w:pPr>
+      <w:r>
+        <w:rPr>
+          <w:i/>
+          <w:color w:val="64748B"/>
+          <w:sz w:val="17"/>
+        </w:rPr>
+        <w:t>Figure 4(b): Ground Subsystem 2D Structural Profile with Baseline &amp; Anomaly Residuals</w:t>
+      </w:r>
+    </w:p>
+    <w:p>
+      <w:pPr>
         <w:keepNext/>
         <w:spacing w:before="200" w:after="60"/>
       </w:pPr>
@@ -1520,11 +1628,15 @@
       </w:r>
     </w:p>
     <w:p>
+      <w:pPr>
+        <w:spacing w:after="40"/>
+        <w:jc w:val="center"/>
+      </w:pPr>
       <w:r>
         <w:drawing>
           <wp:inline xmlns:a="http://schemas.openxmlformats.org/drawingml/2006/main" xmlns:pic="http://schemas.openxmlformats.org/drawingml/2006/picture">
-            <wp:extent cx="5029200" cy="2067669"/>
-            <wp:docPr id="3" name="Picture 3"/>
+            <wp:extent cx="5303520" cy="2180451"/>
+            <wp:docPr id="5" name="Picture 5"/>
             <wp:cNvGraphicFramePr>
               <a:graphicFrameLocks noChangeAspect="1"/>
             </wp:cNvGraphicFramePr>
@@ -1536,7 +1648,7 @@
                     <pic:cNvPicPr/>
                   </pic:nvPicPr>
                   <pic:blipFill>
-                    <a:blip r:embed="rId11"/>
+                    <a:blip r:embed="rId13"/>
                     <a:stretch>
                       <a:fillRect/>
                     </a:stretch>
@@ -1544,7 +1656,7 @@
                   <pic:spPr>
                     <a:xfrm>
                       <a:off x="0" y="0"/>
-                      <a:ext cx="5029200" cy="2067669"/>
+                      <a:ext cx="5303520" cy="2180451"/>
                     </a:xfrm>
                     <a:prstGeom prst="rect"/>
                   </pic:spPr>
@@ -1556,11 +1668,179 @@
       </w:r>
     </w:p>
     <w:p>
+      <w:pPr>
+        <w:spacing w:after="160"/>
+        <w:jc w:val="center"/>
+      </w:pPr>
       <w:r>
         <w:rPr>
+          <w:i/>
+          <w:color w:val="64748B"/>
           <w:sz w:val="17"/>
         </w:rPr>
-        <w:t>Figure 2: YDLIDAR X2 360° 2D Laser Range Scanner Product Listing (Reference Price: ₹7,189 incl. GST)</w:t>
+        <w:t>Figure 5(a): YDLIDAR X2 360° 2D Laser Range Scanner Product Listing (Ref: ₹7,189 incl. GST)</w:t>
+      </w:r>
+    </w:p>
+    <w:p>
+      <w:pPr>
+        <w:spacing w:after="40"/>
+        <w:jc w:val="center"/>
+      </w:pPr>
+      <w:r>
+        <w:drawing>
+          <wp:inline xmlns:a="http://schemas.openxmlformats.org/drawingml/2006/main" xmlns:pic="http://schemas.openxmlformats.org/drawingml/2006/picture">
+            <wp:extent cx="5303520" cy="2486025"/>
+            <wp:docPr id="6" name="Picture 6"/>
+            <wp:cNvGraphicFramePr>
+              <a:graphicFrameLocks noChangeAspect="1"/>
+            </wp:cNvGraphicFramePr>
+            <a:graphic>
+              <a:graphicData uri="http://schemas.openxmlformats.org/drawingml/2006/picture">
+                <pic:pic>
+                  <pic:nvPicPr>
+                    <pic:cNvPr id="0" name="ydlidar_x2_specs.png"/>
+                    <pic:cNvPicPr/>
+                  </pic:nvPicPr>
+                  <pic:blipFill>
+                    <a:blip r:embed="rId14"/>
+                    <a:stretch>
+                      <a:fillRect/>
+                    </a:stretch>
+                  </pic:blipFill>
+                  <pic:spPr>
+                    <a:xfrm>
+                      <a:off x="0" y="0"/>
+                      <a:ext cx="5303520" cy="2486025"/>
+                    </a:xfrm>
+                    <a:prstGeom prst="rect"/>
+                  </pic:spPr>
+                </pic:pic>
+              </a:graphicData>
+            </a:graphic>
+          </wp:inline>
+        </w:drawing>
+      </w:r>
+    </w:p>
+    <w:p>
+      <w:pPr>
+        <w:spacing w:after="160"/>
+        <w:jc w:val="center"/>
+      </w:pPr>
+      <w:r>
+        <w:rPr>
+          <w:i/>
+          <w:color w:val="64748B"/>
+          <w:sz w:val="17"/>
+        </w:rPr>
+        <w:t>Figure 5(b): YDLIDAR X2 Technical Specification Table (3,000 pts/s, 7 Hz, 0.12–8m range)</w:t>
+      </w:r>
+    </w:p>
+    <w:p>
+      <w:pPr>
+        <w:spacing w:after="40"/>
+        <w:jc w:val="center"/>
+      </w:pPr>
+      <w:r>
+        <w:drawing>
+          <wp:inline xmlns:a="http://schemas.openxmlformats.org/drawingml/2006/main" xmlns:pic="http://schemas.openxmlformats.org/drawingml/2006/picture">
+            <wp:extent cx="5303520" cy="2372082"/>
+            <wp:docPr id="7" name="Picture 7"/>
+            <wp:cNvGraphicFramePr>
+              <a:graphicFrameLocks noChangeAspect="1"/>
+            </wp:cNvGraphicFramePr>
+            <a:graphic>
+              <a:graphicData uri="http://schemas.openxmlformats.org/drawingml/2006/picture">
+                <pic:pic>
+                  <pic:nvPicPr>
+                    <pic:cNvPr id="0" name="ydlidar_x2_features.png"/>
+                    <pic:cNvPicPr/>
+                  </pic:nvPicPr>
+                  <pic:blipFill>
+                    <a:blip r:embed="rId15"/>
+                    <a:stretch>
+                      <a:fillRect/>
+                    </a:stretch>
+                  </pic:blipFill>
+                  <pic:spPr>
+                    <a:xfrm>
+                      <a:off x="0" y="0"/>
+                      <a:ext cx="5303520" cy="2372082"/>
+                    </a:xfrm>
+                    <a:prstGeom prst="rect"/>
+                  </pic:spPr>
+                </pic:pic>
+              </a:graphicData>
+            </a:graphic>
+          </wp:inline>
+        </w:drawing>
+      </w:r>
+    </w:p>
+    <w:p>
+      <w:pPr>
+        <w:spacing w:after="160"/>
+        <w:jc w:val="center"/>
+      </w:pPr>
+      <w:r>
+        <w:rPr>
+          <w:i/>
+          <w:color w:val="64748B"/>
+          <w:sz w:val="17"/>
+        </w:rPr>
+        <w:t>Figure 5(c): YDLIDAR X2 Core Features &amp; Autonomous Mapping Applications</w:t>
+      </w:r>
+    </w:p>
+    <w:p>
+      <w:pPr>
+        <w:spacing w:after="40"/>
+        <w:jc w:val="center"/>
+      </w:pPr>
+      <w:r>
+        <w:drawing>
+          <wp:inline xmlns:a="http://schemas.openxmlformats.org/drawingml/2006/main" xmlns:pic="http://schemas.openxmlformats.org/drawingml/2006/picture">
+            <wp:extent cx="3840480" cy="3982243"/>
+            <wp:docPr id="8" name="Picture 8"/>
+            <wp:cNvGraphicFramePr>
+              <a:graphicFrameLocks noChangeAspect="1"/>
+            </wp:cNvGraphicFramePr>
+            <a:graphic>
+              <a:graphicData uri="http://schemas.openxmlformats.org/drawingml/2006/picture">
+                <pic:pic>
+                  <pic:nvPicPr>
+                    <pic:cNvPr id="0" name="drone_airframe.png"/>
+                    <pic:cNvPicPr/>
+                  </pic:nvPicPr>
+                  <pic:blipFill>
+                    <a:blip r:embed="rId16"/>
+                    <a:stretch>
+                      <a:fillRect/>
+                    </a:stretch>
+                  </pic:blipFill>
+                  <pic:spPr>
+                    <a:xfrm>
+                      <a:off x="0" y="0"/>
+                      <a:ext cx="3840480" cy="3982243"/>
+                    </a:xfrm>
+                    <a:prstGeom prst="rect"/>
+                  </pic:spPr>
+                </pic:pic>
+              </a:graphicData>
+            </a:graphic>
+          </wp:inline>
+        </w:drawing>
+      </w:r>
+    </w:p>
+    <w:p>
+      <w:pPr>
+        <w:spacing w:after="160"/>
+        <w:jc w:val="center"/>
+      </w:pPr>
+      <w:r>
+        <w:rPr>
+          <w:i/>
+          <w:color w:val="64748B"/>
+          <w:sz w:val="17"/>
+        </w:rPr>
+        <w:t>Figure 5(d): F450 Development Quadcopter Candidate Airframe with Silicone Damping Deck</w:t>
       </w:r>
     </w:p>
     <w:p>
@@ -3611,55 +3891,276 @@
     <w:p>
       <w:r>
         <w:t>The end-to-end cyber-physical architecture is structured into five verified operational workflows. These diagrams eliminate ambiguity between currently implemented modules and future planned extensions:</w:t>
-        <w:br/>
-        <w:br/>
-        <w:t>Diagram 1: Complete System Architecture:</w:t>
-        <w:br/>
-        <w:t>Physical Target (Concrete Facade, Bridge Pier, Spalls &amp; Bulges) → Embedded Acquisition (TF-Luna 1D ToF, YDLIDAR X2 2D, DFRobot Tilt Sensor, ESP32 dual-core, Checksum validation) → Wireless Telemetry (115200 Baud UART, Wi-Fi 802.11 b/g/n, UDP Socket stream, Dropped frame filter) → Ground Analytics (Rolling baseline d_ref, Deviation Δd, Cavity rule Δd ≥ +3.5cm, Bulge rule Δd ≤ -3.5cm, Crack filter |Δd| ≥ 1.5cm) → Visualization &amp; Audit (3D PLY Digital Twin, Streamlit UI Port 8501, PLY Forge WebGL engine, Defect severity log, PDF Inspection Report).</w:t>
-        <w:br/>
-        <w:br/>
-        <w:t>Diagram 2: Aerial Acquisition Workflow (15377IDP01):</w:t>
-        <w:br/>
-        <w:t>1. Boot &amp; Sync: Initialize ESP32 GPIOs, UART1 (TF-Luna), UART2 (YDLIDAR), and Tilt interrupt.</w:t>
-        <w:br/>
-        <w:t>2. Frame Ingestion: Read 9-byte TF-Luna packet; verify header bytes 0x59 0x59.</w:t>
-        <w:br/>
-        <w:t>3. Checksum Validation: Compute (Σ B0..B7) &amp; 0xFF; if mismatch, DROP frame.</w:t>
-        <w:br/>
-        <w:t>4. Metrology Calibration: Apply linear fit: d_cal = 1.0228 · d_raw + 3.20 cm.</w:t>
-        <w:br/>
-        <w:t>5. Tilt Compensation: Sample tilt angle θ; compute: d_true = d_cal · cos(θ).</w:t>
-        <w:br/>
-        <w:t>6. Median Filter: Buffer N=5 readings; output median to suppress optical outliers.</w:t>
-        <w:br/>
-        <w:t>7. Telemetry Transmission: Format UDP datagram: [Timestamp, d_true, θ, Amplitude]; transmit.</w:t>
-        <w:br/>
-        <w:br/>
-        <w:t>Diagram 3: Ground Analytics Workflow (15377IDP02):</w:t>
-        <w:br/>
-        <w:t>1. Packet Ingestion: Receive UDP datagram on port 5005; parse payload.</w:t>
-        <w:br/>
-        <w:t>2. Baseline Computation: Calculate window mean d_ref over rolling window.</w:t>
-        <w:br/>
-        <w:t>3. Residual Delta: Calculate geometric deviation: Δd = d_meas - d_ref.</w:t>
-        <w:br/>
-        <w:t>4. Defect Classification: Δd ≥ +3.5 cm (Spall Cavity); Δd ≤ -3.5 cm (Structural Bulge); |Δd| ≥ 1.5 cm vs neighbors (Crack Indication).</w:t>
-        <w:br/>
-        <w:t>5. Spatial Projection: Map to global 3D vector: P_global = P_sensor + R_tilt · [d_true, 0, 0]ᵀ.</w:t>
-        <w:br/>
-        <w:t>6. WebGL Digital Twin: Push vertex buffer to PLY Forge GPU canvas; render room twin.</w:t>
-        <w:br/>
-        <w:t>7. Automated Audit: Output timestamped defect coordinate log &amp; PDF report.</w:t>
-        <w:br/>
-        <w:br/>
-        <w:t>Diagram 4: Physical Wiring &amp; Power Architecture:</w:t>
-        <w:br/>
-        <w:t>3S 11.1V LiPo → XT60 → PDB → 4x 30A ESCs → 4x Motors; PDB 11.1V → 5V 5A UBEC → 5.0V bus (TF-Luna 70mA; YDLIDAR X2 500mA; ESP32 Vin 200mA). TF-Luna to UART1 (GPIO 16/17); YDLIDAR X2 to UART2 (GPIO 25/26); Tilt Sensor to GPIO 34. ESP32 Wi-Fi transmits UDP to Ground Base.</w:t>
-        <w:br/>
-        <w:br/>
-        <w:t>Diagram 5: Phased Testing Pipeline:</w:t>
-        <w:br/>
-        <w:t>Hardware Procurement → Benchtop Electrical Verification → Universal Sensor Calibration → Static Testbed Validation → Controlled Linear Motion Testing → Silicone Vibration Damper Tuning → Drone Airframe Integration → Tethered Hover Flight Trials → Live Wireless Telemetry Certification → End-to-End Physical Structural Scan → Faculty Demonstration.</w:t>
+      </w:r>
+    </w:p>
+    <w:p>
+      <w:pPr>
+        <w:spacing w:after="40"/>
+        <w:jc w:val="center"/>
+      </w:pPr>
+      <w:r>
+        <w:drawing>
+          <wp:inline xmlns:a="http://schemas.openxmlformats.org/drawingml/2006/main" xmlns:pic="http://schemas.openxmlformats.org/drawingml/2006/picture">
+            <wp:extent cx="5669280" cy="2096204"/>
+            <wp:docPr id="9" name="Picture 9"/>
+            <wp:cNvGraphicFramePr>
+              <a:graphicFrameLocks noChangeAspect="1"/>
+            </wp:cNvGraphicFramePr>
+            <a:graphic>
+              <a:graphicData uri="http://schemas.openxmlformats.org/drawingml/2006/picture">
+                <pic:pic>
+                  <pic:nvPicPr>
+                    <pic:cNvPr id="0" name="flowchart_system_architecture.png"/>
+                    <pic:cNvPicPr/>
+                  </pic:nvPicPr>
+                  <pic:blipFill>
+                    <a:blip r:embed="rId17"/>
+                    <a:stretch>
+                      <a:fillRect/>
+                    </a:stretch>
+                  </pic:blipFill>
+                  <pic:spPr>
+                    <a:xfrm>
+                      <a:off x="0" y="0"/>
+                      <a:ext cx="5669280" cy="2096204"/>
+                    </a:xfrm>
+                    <a:prstGeom prst="rect"/>
+                  </pic:spPr>
+                </pic:pic>
+              </a:graphicData>
+            </a:graphic>
+          </wp:inline>
+        </w:drawing>
+      </w:r>
+    </w:p>
+    <w:p>
+      <w:pPr>
+        <w:spacing w:after="160"/>
+        <w:jc w:val="center"/>
+      </w:pPr>
+      <w:r>
+        <w:rPr>
+          <w:i/>
+          <w:color w:val="64748B"/>
+          <w:sz w:val="17"/>
+        </w:rPr>
+        <w:t>Figure 7: Diagram 1 — End-to-End Cyber-Physical System Architecture</w:t>
+      </w:r>
+    </w:p>
+    <w:p>
+      <w:pPr>
+        <w:spacing w:after="40"/>
+        <w:jc w:val="center"/>
+      </w:pPr>
+      <w:r>
+        <w:drawing>
+          <wp:inline xmlns:a="http://schemas.openxmlformats.org/drawingml/2006/main" xmlns:pic="http://schemas.openxmlformats.org/drawingml/2006/picture">
+            <wp:extent cx="5303520" cy="2196407"/>
+            <wp:docPr id="10" name="Picture 10"/>
+            <wp:cNvGraphicFramePr>
+              <a:graphicFrameLocks noChangeAspect="1"/>
+            </wp:cNvGraphicFramePr>
+            <a:graphic>
+              <a:graphicData uri="http://schemas.openxmlformats.org/drawingml/2006/picture">
+                <pic:pic>
+                  <pic:nvPicPr>
+                    <pic:cNvPr id="0" name="flowchart_aerial_acquisition.png"/>
+                    <pic:cNvPicPr/>
+                  </pic:nvPicPr>
+                  <pic:blipFill>
+                    <a:blip r:embed="rId18"/>
+                    <a:stretch>
+                      <a:fillRect/>
+                    </a:stretch>
+                  </pic:blipFill>
+                  <pic:spPr>
+                    <a:xfrm>
+                      <a:off x="0" y="0"/>
+                      <a:ext cx="5303520" cy="2196407"/>
+                    </a:xfrm>
+                    <a:prstGeom prst="rect"/>
+                  </pic:spPr>
+                </pic:pic>
+              </a:graphicData>
+            </a:graphic>
+          </wp:inline>
+        </w:drawing>
+      </w:r>
+    </w:p>
+    <w:p>
+      <w:pPr>
+        <w:spacing w:after="160"/>
+        <w:jc w:val="center"/>
+      </w:pPr>
+      <w:r>
+        <w:rPr>
+          <w:i/>
+          <w:color w:val="64748B"/>
+          <w:sz w:val="17"/>
+        </w:rPr>
+        <w:t>Figure 8(a): Diagram 2 — Aerial Embedded Acquisition Workflow (Team 1)</w:t>
+      </w:r>
+    </w:p>
+    <w:p>
+      <w:pPr>
+        <w:spacing w:after="40"/>
+        <w:jc w:val="center"/>
+      </w:pPr>
+      <w:r>
+        <w:drawing>
+          <wp:inline xmlns:a="http://schemas.openxmlformats.org/drawingml/2006/main" xmlns:pic="http://schemas.openxmlformats.org/drawingml/2006/picture">
+            <wp:extent cx="5303520" cy="2187905"/>
+            <wp:docPr id="11" name="Picture 11"/>
+            <wp:cNvGraphicFramePr>
+              <a:graphicFrameLocks noChangeAspect="1"/>
+            </wp:cNvGraphicFramePr>
+            <a:graphic>
+              <a:graphicData uri="http://schemas.openxmlformats.org/drawingml/2006/picture">
+                <pic:pic>
+                  <pic:nvPicPr>
+                    <pic:cNvPr id="0" name="flowchart_ground_analytics.png"/>
+                    <pic:cNvPicPr/>
+                  </pic:nvPicPr>
+                  <pic:blipFill>
+                    <a:blip r:embed="rId19"/>
+                    <a:stretch>
+                      <a:fillRect/>
+                    </a:stretch>
+                  </pic:blipFill>
+                  <pic:spPr>
+                    <a:xfrm>
+                      <a:off x="0" y="0"/>
+                      <a:ext cx="5303520" cy="2187905"/>
+                    </a:xfrm>
+                    <a:prstGeom prst="rect"/>
+                  </pic:spPr>
+                </pic:pic>
+              </a:graphicData>
+            </a:graphic>
+          </wp:inline>
+        </w:drawing>
+      </w:r>
+    </w:p>
+    <w:p>
+      <w:pPr>
+        <w:spacing w:after="160"/>
+        <w:jc w:val="center"/>
+      </w:pPr>
+      <w:r>
+        <w:rPr>
+          <w:i/>
+          <w:color w:val="64748B"/>
+          <w:sz w:val="17"/>
+        </w:rPr>
+        <w:t>Figure 8(b): Diagram 3 — Ground Analytics Decision Tree &amp; Anomaly Classifier (Team 2)</w:t>
+      </w:r>
+    </w:p>
+    <w:p>
+      <w:pPr>
+        <w:spacing w:after="40"/>
+        <w:jc w:val="center"/>
+      </w:pPr>
+      <w:r>
+        <w:drawing>
+          <wp:inline xmlns:a="http://schemas.openxmlformats.org/drawingml/2006/main" xmlns:pic="http://schemas.openxmlformats.org/drawingml/2006/picture">
+            <wp:extent cx="5303520" cy="2196407"/>
+            <wp:docPr id="12" name="Picture 12"/>
+            <wp:cNvGraphicFramePr>
+              <a:graphicFrameLocks noChangeAspect="1"/>
+            </wp:cNvGraphicFramePr>
+            <a:graphic>
+              <a:graphicData uri="http://schemas.openxmlformats.org/drawingml/2006/picture">
+                <pic:pic>
+                  <pic:nvPicPr>
+                    <pic:cNvPr id="0" name="flowchart_power_wiring.png"/>
+                    <pic:cNvPicPr/>
+                  </pic:nvPicPr>
+                  <pic:blipFill>
+                    <a:blip r:embed="rId20"/>
+                    <a:stretch>
+                      <a:fillRect/>
+                    </a:stretch>
+                  </pic:blipFill>
+                  <pic:spPr>
+                    <a:xfrm>
+                      <a:off x="0" y="0"/>
+                      <a:ext cx="5303520" cy="2196407"/>
+                    </a:xfrm>
+                    <a:prstGeom prst="rect"/>
+                  </pic:spPr>
+                </pic:pic>
+              </a:graphicData>
+            </a:graphic>
+          </wp:inline>
+        </w:drawing>
+      </w:r>
+    </w:p>
+    <w:p>
+      <w:pPr>
+        <w:spacing w:after="160"/>
+        <w:jc w:val="center"/>
+      </w:pPr>
+      <w:r>
+        <w:rPr>
+          <w:i/>
+          <w:color w:val="64748B"/>
+          <w:sz w:val="17"/>
+        </w:rPr>
+        <w:t>Figure 9(a): Diagram 4 — Electrical Power &amp; Signal Distribution Architecture</w:t>
+      </w:r>
+    </w:p>
+    <w:p>
+      <w:pPr>
+        <w:spacing w:after="40"/>
+        <w:jc w:val="center"/>
+      </w:pPr>
+      <w:r>
+        <w:drawing>
+          <wp:inline xmlns:a="http://schemas.openxmlformats.org/drawingml/2006/main" xmlns:pic="http://schemas.openxmlformats.org/drawingml/2006/picture">
+            <wp:extent cx="5669280" cy="2132481"/>
+            <wp:docPr id="13" name="Picture 13"/>
+            <wp:cNvGraphicFramePr>
+              <a:graphicFrameLocks noChangeAspect="1"/>
+            </wp:cNvGraphicFramePr>
+            <a:graphic>
+              <a:graphicData uri="http://schemas.openxmlformats.org/drawingml/2006/picture">
+                <pic:pic>
+                  <pic:nvPicPr>
+                    <pic:cNvPr id="0" name="flowchart_testing_roadmap.png"/>
+                    <pic:cNvPicPr/>
+                  </pic:nvPicPr>
+                  <pic:blipFill>
+                    <a:blip r:embed="rId21"/>
+                    <a:stretch>
+                      <a:fillRect/>
+                    </a:stretch>
+                  </pic:blipFill>
+                  <pic:spPr>
+                    <a:xfrm>
+                      <a:off x="0" y="0"/>
+                      <a:ext cx="5669280" cy="2132481"/>
+                    </a:xfrm>
+                    <a:prstGeom prst="rect"/>
+                  </pic:spPr>
+                </pic:pic>
+              </a:graphicData>
+            </a:graphic>
+          </wp:inline>
+        </w:drawing>
+      </w:r>
+    </w:p>
+    <w:p>
+      <w:pPr>
+        <w:spacing w:after="160"/>
+        <w:jc w:val="center"/>
+      </w:pPr>
+      <w:r>
+        <w:rPr>
+          <w:i/>
+          <w:color w:val="64748B"/>
+          <w:sz w:val="17"/>
+        </w:rPr>
+        <w:t>Figure 9(b): Diagram 5 — Phased Implementation &amp; Flight Testing Roadmap</w:t>
       </w:r>
     </w:p>
     <w:p>

</xml_diff>

<commit_message>
docs: enhance flowcharts with full-page high-resolution vector rendering and add platform-wise procurement breakdown (Drone vs Smart 4WD Car)
</commit_message>
<xml_diff>
--- a/BACSE291_ENHANCED_IDP_PROGRESS_REPORT_AND_FUTURE_PLAN.docx
+++ b/BACSE291_ENHANCED_IDP_PROGRESS_REPORT_AND_FUTURE_PLAN.docx
@@ -68,7 +68,7 @@
           <w:color w:val="1E3A8A"/>
           <w:sz w:val="24"/>
         </w:rPr>
-        <w:t>Comprehensive IDP Progress Report, Previous MDP Integration, Dual-Platform Deployment (Aerial Drone &amp; Smart 4WD Car), Hardware Upgrade &amp; Implementation Plan</w:t>
+        <w:t>Comprehensive IDP Progress Report, Previous MDP Integration, Dual-Platform Deployment (Aerial Drone &amp; Smart 4WD Car), Platform-Wise Hardware Budget &amp; Implementation Plan</w:t>
       </w:r>
     </w:p>
     <w:tbl>
@@ -344,7 +344,7 @@
                 <w:i/>
                 <w:sz w:val="20"/>
               </w:rPr>
-              <w:t>This document presents the complete formal engineering review for BACSE291. It provides an exhaustive, evidence-based technical synthesis connecting our prior Multidisciplinary Project (MDP: PLY Forge 3D Point Cloud Processor) to our current Innovative Design Project (IDP). It details the verified aerial acquisition and ground analytics benchmarks, evaluates identified scanning constraints (sensor jitter, manual dragging noise, tilt elongation, motor vibration), presents our Dual-Platform Deployment Strategy (Primary Autonomous Quadcopter Drone vs. Contingency Smart 4WD Ground Robotic Car with Optical Wheel Encoders), justifies essential hardware upgrades (YDLIDAR X2 360° LiDAR, DFRobot Gravity 360° Tilt Sensor, F450 Quadcopter &amp; 3S LiPo), establishes an itemized INR 28,874.00 procurement budget with contingency, and outlines a rigorous 7-phase future roadmap toward autonomous structural health monitoring (SHM).</w:t>
+              <w:t>This document presents the complete formal engineering review for BACSE291. It provides an exhaustive, evidence-based technical synthesis connecting our prior Multidisciplinary Project (MDP: PLY Forge 3D Point Cloud Processor) to our current Innovative Design Project (IDP). It details the verified aerial acquisition and ground analytics benchmarks, evaluates identified scanning constraints (sensor jitter, manual dragging noise, tilt elongation, motor vibration), presents our Dual-Platform Deployment Strategy (Primary Autonomous Quadcopter Drone vs. Contingency Smart 4WD Ground Robotic Car with Optical Wheel Encoders), justifies essential hardware upgrades (YDLIDAR X2 360° LiDAR, DFRobot Gravity 360° Tilt Sensor, F450 Quadcopter &amp; 3S LiPo), provides an explicit Platform-Wise Procurement Budget Breakdown (Drone Requirements vs. Smart Car Requirements), and outlines a rigorous 7-phase future roadmap toward autonomous structural health monitoring (SHM).</w:t>
             </w:r>
           </w:p>
         </w:tc>
@@ -901,13 +901,13 @@
     </w:p>
     <w:p>
       <w:pPr>
-        <w:spacing w:after="120"/>
+        <w:spacing w:before="60" w:after="160"/>
         <w:jc w:val="center"/>
       </w:pPr>
       <w:r>
         <w:rPr>
           <w:i/>
-          <w:color w:val="64748B"/>
+          <w:color w:val="0F172A"/>
           <w:sz w:val="19"/>
         </w:rPr>
         <w:t>Figure 2: Prior MDP Deliverable — PLY Forge Point Cloud Processor UI (Left: Stanford Bunny Demo &amp; Controls; Right: Delaunay Surface Meshing &amp; Region Selection)</w:t>
@@ -1243,13 +1243,13 @@
     </w:p>
     <w:p>
       <w:pPr>
-        <w:spacing w:after="120"/>
+        <w:spacing w:before="60" w:after="160"/>
         <w:jc w:val="center"/>
       </w:pPr>
       <w:r>
         <w:rPr>
           <w:i/>
-          <w:color w:val="64748B"/>
+          <w:color w:val="0F172A"/>
           <w:sz w:val="19"/>
         </w:rPr>
         <w:t>Figure 3: Left: 3D Digital Twin Room Mesh with Almari Bulge (+65cm) &amp; Gate Recess (-60cm); Right: Physical ESP32 + TF-Luna Testbed</w:t>
@@ -1333,13 +1333,13 @@
     </w:p>
     <w:p>
       <w:pPr>
-        <w:spacing w:after="120"/>
+        <w:spacing w:before="60" w:after="160"/>
         <w:jc w:val="center"/>
       </w:pPr>
       <w:r>
         <w:rPr>
           <w:i/>
-          <w:color w:val="64748B"/>
+          <w:color w:val="0F172A"/>
           <w:sz w:val="19"/>
         </w:rPr>
         <w:t>Figure 4: Left: Physical Bench Measuring Tape Calibration Setup; Right: 2D Structural Residual Profile (Ground Station Tab 2)</w:t>
@@ -1476,7 +1476,7 @@
         <w:rPr>
           <w:sz w:val="22"/>
         </w:rPr>
-        <w:t>A 4-wheel drive robotic chassis equipped with four high-torque DC gear motors (1:48 gear ratio), an L298N/TB6612FNG Dual H-Bridge motor driver, and dual optical wheel encoders (20-slot slotted photo-interrupter disks). A rigid, telescoping vertical aluminum mast holds the TF-Luna ToF sensor and YDLIDAR X2 at adjustable heights (0.5 m to 2.0 m elevation).</w:t>
+        <w:t>A 4-wheel drive robotic chassis equipped with four high-torque DC gear motors (1:48 gear ratio), an L298N/TB6612FNG Dual H-Bridge motor driver, and dual optical wheel encoders (20-slot slotted photo-interrupter disks). A rigid, telescoping vertical aluminum mast holds the TF-Luna ToF sensor and YDLIDAR X2 at adjustable heights (0.2 m to 2.2 m elevation).</w:t>
       </w:r>
     </w:p>
     <w:p>
@@ -1551,7 +1551,7 @@
       <w:r>
         <w:drawing>
           <wp:inline xmlns:a="http://schemas.openxmlformats.org/drawingml/2006/main" xmlns:pic="http://schemas.openxmlformats.org/drawingml/2006/picture">
-            <wp:extent cx="5852160" cy="2508069"/>
+            <wp:extent cx="5852160" cy="2584326"/>
             <wp:docPr id="8" name="Picture 8"/>
             <wp:cNvGraphicFramePr>
               <a:graphicFrameLocks noChangeAspect="1"/>
@@ -1572,7 +1572,7 @@
                   <pic:spPr>
                     <a:xfrm>
                       <a:off x="0" y="0"/>
-                      <a:ext cx="5852160" cy="2508069"/>
+                      <a:ext cx="5852160" cy="2584326"/>
                     </a:xfrm>
                     <a:prstGeom prst="rect"/>
                   </pic:spPr>
@@ -1585,13 +1585,13 @@
     </w:p>
     <w:p>
       <w:pPr>
-        <w:spacing w:after="120"/>
+        <w:spacing w:before="60" w:after="160"/>
         <w:jc w:val="center"/>
       </w:pPr>
       <w:r>
         <w:rPr>
           <w:i/>
-          <w:color w:val="64748B"/>
+          <w:color w:val="0F172A"/>
           <w:sz w:val="19"/>
         </w:rPr>
         <w:t>Figure 5: Contingency Platform — Smart 4WD Ground Robotic Car Scanning Architecture &amp; Odometry Workflow</w:t>
@@ -1779,13 +1779,13 @@
     </w:p>
     <w:p>
       <w:pPr>
-        <w:spacing w:after="120"/>
+        <w:spacing w:before="60" w:after="160"/>
         <w:jc w:val="center"/>
       </w:pPr>
       <w:r>
         <w:rPr>
           <w:i/>
-          <w:color w:val="64748B"/>
+          <w:color w:val="0F172A"/>
           <w:sz w:val="19"/>
         </w:rPr>
         <w:t>Figure 6(a): Left: YDLIDAR X2 Robu.in Listing (INR 7,189); Right: Technical Specifications</w:t>
@@ -1869,13 +1869,13 @@
     </w:p>
     <w:p>
       <w:pPr>
-        <w:spacing w:after="120"/>
+        <w:spacing w:before="60" w:after="160"/>
         <w:jc w:val="center"/>
       </w:pPr>
       <w:r>
         <w:rPr>
           <w:i/>
-          <w:color w:val="64748B"/>
+          <w:color w:val="0F172A"/>
           <w:sz w:val="19"/>
         </w:rPr>
         <w:t>Figure 6(b): Left: F450 Quadcopter Airframe; Right: YDLIDAR X2 Dimensional Drawing</w:t>
@@ -1977,7 +1977,7 @@
           <w:color w:val="1E3A8A"/>
           <w:sz w:val="32"/>
         </w:rPr>
-        <w:t>8. Complete Procurement Budget &amp; Financial Analysis</w:t>
+        <w:t>8. Complete Procurement Budget &amp; Platform-Wise Breakdown</w:t>
       </w:r>
     </w:p>
     <w:p>
@@ -1991,7 +1991,64 @@
           <w:i w:val="0"/>
           <w:sz w:val="22"/>
         </w:rPr>
-        <w:t>An itemized, market-verified Bill of Materials (BOM) was compiled using authorized Indian robotics distributors (Robu.in, QuartzComponents, Silverline Electronics). Screenshot prices from the uploaded prompt materials were compared against current live listings. All figures are expressed in Indian Rupees (INR):</w:t>
+        <w:t>To provide complete financial transparency and operational flexibility for faculty review and grant sanctioning, the procurement budget is categorized into three mutually transparent packages based on whether the Aerial Drone, the Smart 4WD Ground Car, or the Integrated Dual-Platform is deployed:</w:t>
+      </w:r>
+    </w:p>
+    <w:p>
+      <w:pPr>
+        <w:pStyle w:val="ListBullet"/>
+        <w:spacing w:after="60" w:line="276" w:lineRule="auto"/>
+      </w:pPr>
+      <w:r>
+        <w:rPr>
+          <w:b/>
+          <w:sz w:val="22"/>
+        </w:rPr>
+        <w:t xml:space="preserve">Shared Core Sensing &amp; Computing Hardware (INR 8,774.00): </w:t>
+      </w:r>
+      <w:r>
+        <w:rPr>
+          <w:sz w:val="22"/>
+        </w:rPr>
+        <w:t>Baseline components required regardless of platform (YDLIDAR X2 360° LiDAR, DFRobot Tilt Sensor, ESP32 MCU, LM2596 buck regulators, wiring harness, shipping).</w:t>
+      </w:r>
+    </w:p>
+    <w:p>
+      <w:pPr>
+        <w:pStyle w:val="ListBullet"/>
+        <w:spacing w:after="60" w:line="276" w:lineRule="auto"/>
+      </w:pPr>
+      <w:r>
+        <w:rPr>
+          <w:b/>
+          <w:sz w:val="22"/>
+        </w:rPr>
+        <w:t xml:space="preserve">Package A — Required ONLY if We Use the Aerial Drone (INR 17,350.00): </w:t>
+      </w:r>
+      <w:r>
+        <w:rPr>
+          <w:sz w:val="22"/>
+        </w:rPr>
+        <w:t>Flight airframe, brushless propulsion, SimonK ESCs, 1045 propellers, 3S 4200mAh LiPo battery, iMAX B6 digital balance charger, Pixhawk 2.4.8 autopilot with GPS/telemetry, and flight reserve.</w:t>
+      </w:r>
+    </w:p>
+    <w:p>
+      <w:pPr>
+        <w:pStyle w:val="ListBullet"/>
+        <w:spacing w:after="60" w:line="276" w:lineRule="auto"/>
+      </w:pPr>
+      <w:r>
+        <w:rPr>
+          <w:b/>
+          <w:sz w:val="22"/>
+        </w:rPr>
+        <w:t xml:space="preserve">Package B — Required ONLY if We Use the Smart 4WD Ground Car (INR 3,830.00): </w:t>
+      </w:r>
+      <w:r>
+        <w:rPr>
+          <w:sz w:val="22"/>
+        </w:rPr>
+        <w:t>High-traction 4WD chassis kit, four 1:48 DC gear motors, dual 20-slot optical wheel encoders for odometry, L298N motor driver, telescoping aluminum sensor mast, 12V Li-ion pack, and ground reserve.</w:t>
       </w:r>
     </w:p>
     <w:tbl>
@@ -2009,18 +2066,17 @@
         </w:tblBorders>
       </w:tblPr>
       <w:tblGrid>
-        <w:gridCol w:w="1461"/>
-        <w:gridCol w:w="1461"/>
-        <w:gridCol w:w="1461"/>
-        <w:gridCol w:w="1461"/>
-        <w:gridCol w:w="1461"/>
-        <w:gridCol w:w="1461"/>
-        <w:gridCol w:w="1461"/>
+        <w:gridCol w:w="1704"/>
+        <w:gridCol w:w="1704"/>
+        <w:gridCol w:w="1704"/>
+        <w:gridCol w:w="1704"/>
+        <w:gridCol w:w="1704"/>
+        <w:gridCol w:w="1704"/>
       </w:tblGrid>
       <w:tr>
         <w:tc>
           <w:tcPr>
-            <w:tcW w:type="dxa" w:w="1461"/>
+            <w:tcW w:type="dxa" w:w="1704"/>
             <w:shd w:fill="1E3A8A"/>
             <w:tcMar>
               <w:top w:w="60" w:type="dxa"/>
@@ -2045,7 +2101,7 @@
         </w:tc>
         <w:tc>
           <w:tcPr>
-            <w:tcW w:type="dxa" w:w="1461"/>
+            <w:tcW w:type="dxa" w:w="1704"/>
             <w:shd w:fill="1E3A8A"/>
             <w:tcMar>
               <w:top w:w="60" w:type="dxa"/>
@@ -2064,13 +2120,13 @@
                 <w:color w:val="FFFFFF"/>
                 <w:sz w:val="17"/>
               </w:rPr>
-              <w:t>Category</w:t>
+              <w:t>Platform Requirement</w:t>
             </w:r>
           </w:p>
         </w:tc>
         <w:tc>
           <w:tcPr>
-            <w:tcW w:type="dxa" w:w="1461"/>
+            <w:tcW w:type="dxa" w:w="1704"/>
             <w:shd w:fill="1E3A8A"/>
             <w:tcMar>
               <w:top w:w="60" w:type="dxa"/>
@@ -2095,7 +2151,7 @@
         </w:tc>
         <w:tc>
           <w:tcPr>
-            <w:tcW w:type="dxa" w:w="1461"/>
+            <w:tcW w:type="dxa" w:w="1704"/>
             <w:shd w:fill="1E3A8A"/>
             <w:tcMar>
               <w:top w:w="60" w:type="dxa"/>
@@ -2114,38 +2170,13 @@
                 <w:color w:val="FFFFFF"/>
                 <w:sz w:val="17"/>
               </w:rPr>
-              <w:t>Ref Price</w:t>
+              <w:t>Unit Price</w:t>
             </w:r>
           </w:p>
         </w:tc>
         <w:tc>
           <w:tcPr>
-            <w:tcW w:type="dxa" w:w="1461"/>
-            <w:shd w:fill="1E3A8A"/>
-            <w:tcMar>
-              <w:top w:w="60" w:type="dxa"/>
-              <w:bottom w:w="60" w:type="dxa"/>
-              <w:left w:w="80" w:type="dxa"/>
-              <w:right w:w="80" w:type="dxa"/>
-            </w:tcMar>
-          </w:tcPr>
-          <w:p>
-            <w:pPr>
-              <w:spacing w:line="252" w:lineRule="auto"/>
-            </w:pPr>
-            <w:r>
-              <w:rPr>
-                <w:b/>
-                <w:color w:val="FFFFFF"/>
-                <w:sz w:val="17"/>
-              </w:rPr>
-              <w:t>Verified Price</w:t>
-            </w:r>
-          </w:p>
-        </w:tc>
-        <w:tc>
-          <w:tcPr>
-            <w:tcW w:type="dxa" w:w="1461"/>
+            <w:tcW w:type="dxa" w:w="1704"/>
             <w:shd w:fill="1E3A8A"/>
             <w:tcMar>
               <w:top w:w="60" w:type="dxa"/>
@@ -2170,7 +2201,7 @@
         </w:tc>
         <w:tc>
           <w:tcPr>
-            <w:tcW w:type="dxa" w:w="1461"/>
+            <w:tcW w:type="dxa" w:w="1704"/>
             <w:shd w:fill="1E3A8A"/>
             <w:tcMar>
               <w:top w:w="60" w:type="dxa"/>
@@ -2189,7 +2220,7 @@
                 <w:color w:val="FFFFFF"/>
                 <w:sz w:val="17"/>
               </w:rPr>
-              <w:t>Supplier / Source Status</w:t>
+              <w:t>Supplier / Ref Source</w:t>
             </w:r>
           </w:p>
         </w:tc>
@@ -2197,7 +2228,153 @@
       <w:tr>
         <w:tc>
           <w:tcPr>
-            <w:tcW w:type="dxa" w:w="1461"/>
+            <w:tcW w:type="dxa" w:w="1704"/>
+            <w:shd w:fill="E2E8F0"/>
+            <w:tcMar>
+              <w:top w:w="60" w:type="dxa"/>
+              <w:bottom w:w="60" w:type="dxa"/>
+              <w:left w:w="80" w:type="dxa"/>
+              <w:right w:w="80" w:type="dxa"/>
+            </w:tcMar>
+          </w:tcPr>
+          <w:p>
+            <w:pPr>
+              <w:spacing w:line="252" w:lineRule="auto"/>
+            </w:pPr>
+            <w:r>
+              <w:rPr>
+                <w:b/>
+                <w:sz w:val="17"/>
+              </w:rPr>
+              <w:t>PART 1: SHARED CORE SENSING &amp; COMPUTING</w:t>
+            </w:r>
+          </w:p>
+        </w:tc>
+        <w:tc>
+          <w:tcPr>
+            <w:tcW w:type="dxa" w:w="1704"/>
+            <w:shd w:fill="E2E8F0"/>
+            <w:tcMar>
+              <w:top w:w="60" w:type="dxa"/>
+              <w:bottom w:w="60" w:type="dxa"/>
+              <w:left w:w="80" w:type="dxa"/>
+              <w:right w:w="80" w:type="dxa"/>
+            </w:tcMar>
+          </w:tcPr>
+          <w:p>
+            <w:pPr>
+              <w:spacing w:line="252" w:lineRule="auto"/>
+            </w:pPr>
+            <w:r>
+              <w:rPr>
+                <w:b/>
+                <w:sz w:val="17"/>
+              </w:rPr>
+              <w:t>COMMON TO BOTH</w:t>
+            </w:r>
+          </w:p>
+        </w:tc>
+        <w:tc>
+          <w:tcPr>
+            <w:tcW w:type="dxa" w:w="1704"/>
+            <w:shd w:fill="E2E8F0"/>
+            <w:tcMar>
+              <w:top w:w="60" w:type="dxa"/>
+              <w:bottom w:w="60" w:type="dxa"/>
+              <w:left w:w="80" w:type="dxa"/>
+              <w:right w:w="80" w:type="dxa"/>
+            </w:tcMar>
+          </w:tcPr>
+          <w:p>
+            <w:pPr>
+              <w:spacing w:line="252" w:lineRule="auto"/>
+            </w:pPr>
+            <w:r>
+              <w:rPr>
+                <w:b/>
+                <w:sz w:val="17"/>
+              </w:rPr>
+              <w:t>--</w:t>
+            </w:r>
+          </w:p>
+        </w:tc>
+        <w:tc>
+          <w:tcPr>
+            <w:tcW w:type="dxa" w:w="1704"/>
+            <w:shd w:fill="E2E8F0"/>
+            <w:tcMar>
+              <w:top w:w="60" w:type="dxa"/>
+              <w:bottom w:w="60" w:type="dxa"/>
+              <w:left w:w="80" w:type="dxa"/>
+              <w:right w:w="80" w:type="dxa"/>
+            </w:tcMar>
+          </w:tcPr>
+          <w:p>
+            <w:pPr>
+              <w:spacing w:line="252" w:lineRule="auto"/>
+            </w:pPr>
+            <w:r>
+              <w:rPr>
+                <w:b/>
+                <w:sz w:val="17"/>
+              </w:rPr>
+              <w:t>--</w:t>
+            </w:r>
+          </w:p>
+        </w:tc>
+        <w:tc>
+          <w:tcPr>
+            <w:tcW w:type="dxa" w:w="1704"/>
+            <w:shd w:fill="E2E8F0"/>
+            <w:tcMar>
+              <w:top w:w="60" w:type="dxa"/>
+              <w:bottom w:w="60" w:type="dxa"/>
+              <w:left w:w="80" w:type="dxa"/>
+              <w:right w:w="80" w:type="dxa"/>
+            </w:tcMar>
+          </w:tcPr>
+          <w:p>
+            <w:pPr>
+              <w:spacing w:line="252" w:lineRule="auto"/>
+            </w:pPr>
+            <w:r>
+              <w:rPr>
+                <w:b/>
+                <w:sz w:val="17"/>
+              </w:rPr>
+              <w:t>8,774.00</w:t>
+            </w:r>
+          </w:p>
+        </w:tc>
+        <w:tc>
+          <w:tcPr>
+            <w:tcW w:type="dxa" w:w="1704"/>
+            <w:shd w:fill="E2E8F0"/>
+            <w:tcMar>
+              <w:top w:w="60" w:type="dxa"/>
+              <w:bottom w:w="60" w:type="dxa"/>
+              <w:left w:w="80" w:type="dxa"/>
+              <w:right w:w="80" w:type="dxa"/>
+            </w:tcMar>
+          </w:tcPr>
+          <w:p>
+            <w:pPr>
+              <w:spacing w:line="252" w:lineRule="auto"/>
+            </w:pPr>
+            <w:r>
+              <w:rPr>
+                <w:b/>
+                <w:sz w:val="17"/>
+              </w:rPr>
+              <w:t>Essential for Drone &amp; Car</w:t>
+            </w:r>
+          </w:p>
+        </w:tc>
+      </w:tr>
+      <w:tr>
+        <w:tc>
+          <w:tcPr>
+            <w:tcW w:type="dxa" w:w="1704"/>
             <w:tcMar>
               <w:top w:w="60" w:type="dxa"/>
               <w:bottom w:w="60" w:type="dxa"/>
@@ -2220,7 +2397,7 @@
         </w:tc>
         <w:tc>
           <w:tcPr>
-            <w:tcW w:type="dxa" w:w="1461"/>
+            <w:tcW w:type="dxa" w:w="1704"/>
             <w:tcMar>
               <w:top w:w="60" w:type="dxa"/>
               <w:bottom w:w="60" w:type="dxa"/>
@@ -2236,13 +2413,13 @@
               <w:rPr>
                 <w:sz w:val="17"/>
               </w:rPr>
-              <w:t>LiDAR Sensor</w:t>
+              <w:t>Both (Drone &amp; Car)</w:t>
             </w:r>
           </w:p>
         </w:tc>
         <w:tc>
           <w:tcPr>
-            <w:tcW w:type="dxa" w:w="1461"/>
+            <w:tcW w:type="dxa" w:w="1704"/>
             <w:tcMar>
               <w:top w:w="60" w:type="dxa"/>
               <w:bottom w:w="60" w:type="dxa"/>
@@ -2264,7 +2441,7 @@
         </w:tc>
         <w:tc>
           <w:tcPr>
-            <w:tcW w:type="dxa" w:w="1461"/>
+            <w:tcW w:type="dxa" w:w="1704"/>
             <w:tcMar>
               <w:top w:w="60" w:type="dxa"/>
               <w:bottom w:w="60" w:type="dxa"/>
@@ -2286,29 +2463,7 @@
         </w:tc>
         <w:tc>
           <w:tcPr>
-            <w:tcW w:type="dxa" w:w="1461"/>
-            <w:tcMar>
-              <w:top w:w="60" w:type="dxa"/>
-              <w:bottom w:w="60" w:type="dxa"/>
-              <w:left w:w="80" w:type="dxa"/>
-              <w:right w:w="80" w:type="dxa"/>
-            </w:tcMar>
-          </w:tcPr>
-          <w:p>
-            <w:pPr>
-              <w:spacing w:line="252" w:lineRule="auto"/>
-            </w:pPr>
-            <w:r>
-              <w:rPr>
-                <w:sz w:val="17"/>
-              </w:rPr>
-              <w:t>7,189.00</w:t>
-            </w:r>
-          </w:p>
-        </w:tc>
-        <w:tc>
-          <w:tcPr>
-            <w:tcW w:type="dxa" w:w="1461"/>
+            <w:tcW w:type="dxa" w:w="1704"/>
             <w:tcMar>
               <w:top w:w="60" w:type="dxa"/>
               <w:bottom w:w="60" w:type="dxa"/>
@@ -2331,7 +2486,7 @@
         </w:tc>
         <w:tc>
           <w:tcPr>
-            <w:tcW w:type="dxa" w:w="1461"/>
+            <w:tcW w:type="dxa" w:w="1704"/>
             <w:tcMar>
               <w:top w:w="60" w:type="dxa"/>
               <w:bottom w:w="60" w:type="dxa"/>
@@ -2355,7 +2510,7 @@
       <w:tr>
         <w:tc>
           <w:tcPr>
-            <w:tcW w:type="dxa" w:w="1461"/>
+            <w:tcW w:type="dxa" w:w="1704"/>
             <w:tcMar>
               <w:top w:w="60" w:type="dxa"/>
               <w:bottom w:w="60" w:type="dxa"/>
@@ -2378,7 +2533,7 @@
         </w:tc>
         <w:tc>
           <w:tcPr>
-            <w:tcW w:type="dxa" w:w="1461"/>
+            <w:tcW w:type="dxa" w:w="1704"/>
             <w:tcMar>
               <w:top w:w="60" w:type="dxa"/>
               <w:bottom w:w="60" w:type="dxa"/>
@@ -2394,13 +2549,13 @@
               <w:rPr>
                 <w:sz w:val="17"/>
               </w:rPr>
-              <w:t>Orientation Sensor</w:t>
+              <w:t>Both (Drone &amp; Car)</w:t>
             </w:r>
           </w:p>
         </w:tc>
         <w:tc>
           <w:tcPr>
-            <w:tcW w:type="dxa" w:w="1461"/>
+            <w:tcW w:type="dxa" w:w="1704"/>
             <w:tcMar>
               <w:top w:w="60" w:type="dxa"/>
               <w:bottom w:w="60" w:type="dxa"/>
@@ -2422,29 +2577,7 @@
         </w:tc>
         <w:tc>
           <w:tcPr>
-            <w:tcW w:type="dxa" w:w="1461"/>
-            <w:tcMar>
-              <w:top w:w="60" w:type="dxa"/>
-              <w:bottom w:w="60" w:type="dxa"/>
-              <w:left w:w="80" w:type="dxa"/>
-              <w:right w:w="80" w:type="dxa"/>
-            </w:tcMar>
-          </w:tcPr>
-          <w:p>
-            <w:pPr>
-              <w:spacing w:line="252" w:lineRule="auto"/>
-            </w:pPr>
-            <w:r>
-              <w:rPr>
-                <w:sz w:val="17"/>
-              </w:rPr>
-              <w:t>237.36</w:t>
-            </w:r>
-          </w:p>
-        </w:tc>
-        <w:tc>
-          <w:tcPr>
-            <w:tcW w:type="dxa" w:w="1461"/>
+            <w:tcW w:type="dxa" w:w="1704"/>
             <w:tcMar>
               <w:top w:w="60" w:type="dxa"/>
               <w:bottom w:w="60" w:type="dxa"/>
@@ -2466,7 +2599,7 @@
         </w:tc>
         <w:tc>
           <w:tcPr>
-            <w:tcW w:type="dxa" w:w="1461"/>
+            <w:tcW w:type="dxa" w:w="1704"/>
             <w:tcMar>
               <w:top w:w="60" w:type="dxa"/>
               <w:bottom w:w="60" w:type="dxa"/>
@@ -2489,7 +2622,7 @@
         </w:tc>
         <w:tc>
           <w:tcPr>
-            <w:tcW w:type="dxa" w:w="1461"/>
+            <w:tcW w:type="dxa" w:w="1704"/>
             <w:tcMar>
               <w:top w:w="60" w:type="dxa"/>
               <w:bottom w:w="60" w:type="dxa"/>
@@ -2513,7 +2646,7 @@
       <w:tr>
         <w:tc>
           <w:tcPr>
-            <w:tcW w:type="dxa" w:w="1461"/>
+            <w:tcW w:type="dxa" w:w="1704"/>
             <w:tcMar>
               <w:top w:w="60" w:type="dxa"/>
               <w:bottom w:w="60" w:type="dxa"/>
@@ -2530,13 +2663,13 @@
                 <w:b/>
                 <w:sz w:val="17"/>
               </w:rPr>
-              <w:t>Smart 4WD Robotic Car Kit + Encoders + L298N</w:t>
+              <w:t>ESP32-WROOM-32 Development Board</w:t>
             </w:r>
           </w:p>
         </w:tc>
         <w:tc>
           <w:tcPr>
-            <w:tcW w:type="dxa" w:w="1461"/>
+            <w:tcW w:type="dxa" w:w="1704"/>
             <w:tcMar>
               <w:top w:w="60" w:type="dxa"/>
               <w:bottom w:w="60" w:type="dxa"/>
@@ -2552,13 +2685,13 @@
               <w:rPr>
                 <w:sz w:val="17"/>
               </w:rPr>
-              <w:t>Contingency Platform</w:t>
+              <w:t>Both (Drone &amp; Car)</w:t>
             </w:r>
           </w:p>
         </w:tc>
         <w:tc>
           <w:tcPr>
-            <w:tcW w:type="dxa" w:w="1461"/>
+            <w:tcW w:type="dxa" w:w="1704"/>
             <w:tcMar>
               <w:top w:w="60" w:type="dxa"/>
               <w:bottom w:w="60" w:type="dxa"/>
@@ -2574,13 +2707,13 @@
               <w:rPr>
                 <w:sz w:val="17"/>
               </w:rPr>
-              <w:t>1 kit</w:t>
+              <w:t>1</w:t>
             </w:r>
           </w:p>
         </w:tc>
         <w:tc>
           <w:tcPr>
-            <w:tcW w:type="dxa" w:w="1461"/>
+            <w:tcW w:type="dxa" w:w="1704"/>
             <w:tcMar>
               <w:top w:w="60" w:type="dxa"/>
               <w:bottom w:w="60" w:type="dxa"/>
@@ -2596,35 +2729,13 @@
               <w:rPr>
                 <w:sz w:val="17"/>
               </w:rPr>
-              <w:t>1,850.00</w:t>
+              <w:t>380.00</w:t>
             </w:r>
           </w:p>
         </w:tc>
         <w:tc>
           <w:tcPr>
-            <w:tcW w:type="dxa" w:w="1461"/>
-            <w:tcMar>
-              <w:top w:w="60" w:type="dxa"/>
-              <w:bottom w:w="60" w:type="dxa"/>
-              <w:left w:w="80" w:type="dxa"/>
-              <w:right w:w="80" w:type="dxa"/>
-            </w:tcMar>
-          </w:tcPr>
-          <w:p>
-            <w:pPr>
-              <w:spacing w:line="252" w:lineRule="auto"/>
-            </w:pPr>
-            <w:r>
-              <w:rPr>
-                <w:sz w:val="17"/>
-              </w:rPr>
-              <w:t>1,750.00</w:t>
-            </w:r>
-          </w:p>
-        </w:tc>
-        <w:tc>
-          <w:tcPr>
-            <w:tcW w:type="dxa" w:w="1461"/>
+            <w:tcW w:type="dxa" w:w="1704"/>
             <w:tcMar>
               <w:top w:w="60" w:type="dxa"/>
               <w:bottom w:w="60" w:type="dxa"/>
@@ -2641,13 +2752,149 @@
                 <w:b/>
                 <w:sz w:val="17"/>
               </w:rPr>
-              <w:t>1,750.00</w:t>
+              <w:t>380.00</w:t>
             </w:r>
           </w:p>
         </w:tc>
         <w:tc>
           <w:tcPr>
-            <w:tcW w:type="dxa" w:w="1461"/>
+            <w:tcW w:type="dxa" w:w="1704"/>
+            <w:tcMar>
+              <w:top w:w="60" w:type="dxa"/>
+              <w:bottom w:w="60" w:type="dxa"/>
+              <w:left w:w="80" w:type="dxa"/>
+              <w:right w:w="80" w:type="dxa"/>
+            </w:tcMar>
+          </w:tcPr>
+          <w:p>
+            <w:pPr>
+              <w:spacing w:line="252" w:lineRule="auto"/>
+            </w:pPr>
+            <w:r>
+              <w:rPr>
+                <w:sz w:val="17"/>
+              </w:rPr>
+              <w:t>Robu.in / In Stock</w:t>
+            </w:r>
+          </w:p>
+        </w:tc>
+      </w:tr>
+      <w:tr>
+        <w:tc>
+          <w:tcPr>
+            <w:tcW w:type="dxa" w:w="1704"/>
+            <w:tcMar>
+              <w:top w:w="60" w:type="dxa"/>
+              <w:bottom w:w="60" w:type="dxa"/>
+              <w:left w:w="80" w:type="dxa"/>
+              <w:right w:w="80" w:type="dxa"/>
+            </w:tcMar>
+          </w:tcPr>
+          <w:p>
+            <w:pPr>
+              <w:spacing w:line="252" w:lineRule="auto"/>
+            </w:pPr>
+            <w:r>
+              <w:rPr>
+                <w:b/>
+                <w:sz w:val="17"/>
+              </w:rPr>
+              <w:t>LM2596 DC-DC Buck Step-Down Voltage Regulator</w:t>
+            </w:r>
+          </w:p>
+        </w:tc>
+        <w:tc>
+          <w:tcPr>
+            <w:tcW w:type="dxa" w:w="1704"/>
+            <w:tcMar>
+              <w:top w:w="60" w:type="dxa"/>
+              <w:bottom w:w="60" w:type="dxa"/>
+              <w:left w:w="80" w:type="dxa"/>
+              <w:right w:w="80" w:type="dxa"/>
+            </w:tcMar>
+          </w:tcPr>
+          <w:p>
+            <w:pPr>
+              <w:spacing w:line="252" w:lineRule="auto"/>
+            </w:pPr>
+            <w:r>
+              <w:rPr>
+                <w:sz w:val="17"/>
+              </w:rPr>
+              <w:t>Both (Drone &amp; Car)</w:t>
+            </w:r>
+          </w:p>
+        </w:tc>
+        <w:tc>
+          <w:tcPr>
+            <w:tcW w:type="dxa" w:w="1704"/>
+            <w:tcMar>
+              <w:top w:w="60" w:type="dxa"/>
+              <w:bottom w:w="60" w:type="dxa"/>
+              <w:left w:w="80" w:type="dxa"/>
+              <w:right w:w="80" w:type="dxa"/>
+            </w:tcMar>
+          </w:tcPr>
+          <w:p>
+            <w:pPr>
+              <w:spacing w:line="252" w:lineRule="auto"/>
+            </w:pPr>
+            <w:r>
+              <w:rPr>
+                <w:sz w:val="17"/>
+              </w:rPr>
+              <w:t>2</w:t>
+            </w:r>
+          </w:p>
+        </w:tc>
+        <w:tc>
+          <w:tcPr>
+            <w:tcW w:type="dxa" w:w="1704"/>
+            <w:tcMar>
+              <w:top w:w="60" w:type="dxa"/>
+              <w:bottom w:w="60" w:type="dxa"/>
+              <w:left w:w="80" w:type="dxa"/>
+              <w:right w:w="80" w:type="dxa"/>
+            </w:tcMar>
+          </w:tcPr>
+          <w:p>
+            <w:pPr>
+              <w:spacing w:line="252" w:lineRule="auto"/>
+            </w:pPr>
+            <w:r>
+              <w:rPr>
+                <w:sz w:val="17"/>
+              </w:rPr>
+              <w:t>120.00</w:t>
+            </w:r>
+          </w:p>
+        </w:tc>
+        <w:tc>
+          <w:tcPr>
+            <w:tcW w:type="dxa" w:w="1704"/>
+            <w:tcMar>
+              <w:top w:w="60" w:type="dxa"/>
+              <w:bottom w:w="60" w:type="dxa"/>
+              <w:left w:w="80" w:type="dxa"/>
+              <w:right w:w="80" w:type="dxa"/>
+            </w:tcMar>
+          </w:tcPr>
+          <w:p>
+            <w:pPr>
+              <w:spacing w:line="252" w:lineRule="auto"/>
+            </w:pPr>
+            <w:r>
+              <w:rPr>
+                <w:b/>
+                <w:sz w:val="17"/>
+              </w:rPr>
+              <w:t>240.00</w:t>
+            </w:r>
+          </w:p>
+        </w:tc>
+        <w:tc>
+          <w:tcPr>
+            <w:tcW w:type="dxa" w:w="1704"/>
             <w:tcMar>
               <w:top w:w="60" w:type="dxa"/>
               <w:bottom w:w="60" w:type="dxa"/>
@@ -2671,7 +2918,7 @@
       <w:tr>
         <w:tc>
           <w:tcPr>
-            <w:tcW w:type="dxa" w:w="1461"/>
+            <w:tcW w:type="dxa" w:w="1704"/>
             <w:tcMar>
               <w:top w:w="60" w:type="dxa"/>
               <w:bottom w:w="60" w:type="dxa"/>
@@ -2688,13 +2935,13 @@
                 <w:b/>
                 <w:sz w:val="17"/>
               </w:rPr>
-              <w:t>F450 Quadcopter Drone Frame Kit + Landing Gear</w:t>
+              <w:t>Wiring Harness, XT60 &amp; JST Connectors, Hardware</w:t>
             </w:r>
           </w:p>
         </w:tc>
         <w:tc>
           <w:tcPr>
-            <w:tcW w:type="dxa" w:w="1461"/>
+            <w:tcW w:type="dxa" w:w="1704"/>
             <w:tcMar>
               <w:top w:w="60" w:type="dxa"/>
               <w:bottom w:w="60" w:type="dxa"/>
@@ -2710,13 +2957,13 @@
               <w:rPr>
                 <w:sz w:val="17"/>
               </w:rPr>
-              <w:t>Aerial Airframe</w:t>
+              <w:t>Both (Drone &amp; Car)</w:t>
             </w:r>
           </w:p>
         </w:tc>
         <w:tc>
           <w:tcPr>
-            <w:tcW w:type="dxa" w:w="1461"/>
+            <w:tcW w:type="dxa" w:w="1704"/>
             <w:tcMar>
               <w:top w:w="60" w:type="dxa"/>
               <w:bottom w:w="60" w:type="dxa"/>
@@ -2732,13 +2979,13 @@
               <w:rPr>
                 <w:sz w:val="17"/>
               </w:rPr>
-              <w:t>1</w:t>
+              <w:t>1 lot</w:t>
             </w:r>
           </w:p>
         </w:tc>
         <w:tc>
           <w:tcPr>
-            <w:tcW w:type="dxa" w:w="1461"/>
+            <w:tcW w:type="dxa" w:w="1704"/>
             <w:tcMar>
               <w:top w:w="60" w:type="dxa"/>
               <w:bottom w:w="60" w:type="dxa"/>
@@ -2754,35 +3001,13 @@
               <w:rPr>
                 <w:sz w:val="17"/>
               </w:rPr>
-              <w:t>1,450.00</w:t>
+              <w:t>320.00</w:t>
             </w:r>
           </w:p>
         </w:tc>
         <w:tc>
           <w:tcPr>
-            <w:tcW w:type="dxa" w:w="1461"/>
-            <w:tcMar>
-              <w:top w:w="60" w:type="dxa"/>
-              <w:bottom w:w="60" w:type="dxa"/>
-              <w:left w:w="80" w:type="dxa"/>
-              <w:right w:w="80" w:type="dxa"/>
-            </w:tcMar>
-          </w:tcPr>
-          <w:p>
-            <w:pPr>
-              <w:spacing w:line="252" w:lineRule="auto"/>
-            </w:pPr>
-            <w:r>
-              <w:rPr>
-                <w:sz w:val="17"/>
-              </w:rPr>
-              <w:t>1,350.00</w:t>
-            </w:r>
-          </w:p>
-        </w:tc>
-        <w:tc>
-          <w:tcPr>
-            <w:tcW w:type="dxa" w:w="1461"/>
+            <w:tcW w:type="dxa" w:w="1704"/>
             <w:tcMar>
               <w:top w:w="60" w:type="dxa"/>
               <w:bottom w:w="60" w:type="dxa"/>
@@ -2799,13 +3024,13 @@
                 <w:b/>
                 <w:sz w:val="17"/>
               </w:rPr>
-              <w:t>1,350.00</w:t>
+              <w:t>320.00</w:t>
             </w:r>
           </w:p>
         </w:tc>
         <w:tc>
           <w:tcPr>
-            <w:tcW w:type="dxa" w:w="1461"/>
+            <w:tcW w:type="dxa" w:w="1704"/>
             <w:tcMar>
               <w:top w:w="60" w:type="dxa"/>
               <w:bottom w:w="60" w:type="dxa"/>
@@ -2829,7 +3054,425 @@
       <w:tr>
         <w:tc>
           <w:tcPr>
-            <w:tcW w:type="dxa" w:w="1461"/>
+            <w:tcW w:type="dxa" w:w="1704"/>
+            <w:tcMar>
+              <w:top w:w="60" w:type="dxa"/>
+              <w:bottom w:w="60" w:type="dxa"/>
+              <w:left w:w="80" w:type="dxa"/>
+              <w:right w:w="80" w:type="dxa"/>
+            </w:tcMar>
+          </w:tcPr>
+          <w:p>
+            <w:pPr>
+              <w:spacing w:line="252" w:lineRule="auto"/>
+            </w:pPr>
+            <w:r>
+              <w:rPr>
+                <w:b/>
+                <w:sz w:val="17"/>
+              </w:rPr>
+              <w:t>Consolidated Domestic Shipping (GST Registered)</w:t>
+            </w:r>
+          </w:p>
+        </w:tc>
+        <w:tc>
+          <w:tcPr>
+            <w:tcW w:type="dxa" w:w="1704"/>
+            <w:tcMar>
+              <w:top w:w="60" w:type="dxa"/>
+              <w:bottom w:w="60" w:type="dxa"/>
+              <w:left w:w="80" w:type="dxa"/>
+              <w:right w:w="80" w:type="dxa"/>
+            </w:tcMar>
+          </w:tcPr>
+          <w:p>
+            <w:pPr>
+              <w:spacing w:line="252" w:lineRule="auto"/>
+            </w:pPr>
+            <w:r>
+              <w:rPr>
+                <w:sz w:val="17"/>
+              </w:rPr>
+              <w:t>Both (Drone &amp; Car)</w:t>
+            </w:r>
+          </w:p>
+        </w:tc>
+        <w:tc>
+          <w:tcPr>
+            <w:tcW w:type="dxa" w:w="1704"/>
+            <w:tcMar>
+              <w:top w:w="60" w:type="dxa"/>
+              <w:bottom w:w="60" w:type="dxa"/>
+              <w:left w:w="80" w:type="dxa"/>
+              <w:right w:w="80" w:type="dxa"/>
+            </w:tcMar>
+          </w:tcPr>
+          <w:p>
+            <w:pPr>
+              <w:spacing w:line="252" w:lineRule="auto"/>
+            </w:pPr>
+            <w:r>
+              <w:rPr>
+                <w:sz w:val="17"/>
+              </w:rPr>
+              <w:t>1 lot</w:t>
+            </w:r>
+          </w:p>
+        </w:tc>
+        <w:tc>
+          <w:tcPr>
+            <w:tcW w:type="dxa" w:w="1704"/>
+            <w:tcMar>
+              <w:top w:w="60" w:type="dxa"/>
+              <w:bottom w:w="60" w:type="dxa"/>
+              <w:left w:w="80" w:type="dxa"/>
+              <w:right w:w="80" w:type="dxa"/>
+            </w:tcMar>
+          </w:tcPr>
+          <w:p>
+            <w:pPr>
+              <w:spacing w:line="252" w:lineRule="auto"/>
+            </w:pPr>
+            <w:r>
+              <w:rPr>
+                <w:sz w:val="17"/>
+              </w:rPr>
+              <w:t>400.00</w:t>
+            </w:r>
+          </w:p>
+        </w:tc>
+        <w:tc>
+          <w:tcPr>
+            <w:tcW w:type="dxa" w:w="1704"/>
+            <w:tcMar>
+              <w:top w:w="60" w:type="dxa"/>
+              <w:bottom w:w="60" w:type="dxa"/>
+              <w:left w:w="80" w:type="dxa"/>
+              <w:right w:w="80" w:type="dxa"/>
+            </w:tcMar>
+          </w:tcPr>
+          <w:p>
+            <w:pPr>
+              <w:spacing w:line="252" w:lineRule="auto"/>
+            </w:pPr>
+            <w:r>
+              <w:rPr>
+                <w:b/>
+                <w:sz w:val="17"/>
+              </w:rPr>
+              <w:t>400.00</w:t>
+            </w:r>
+          </w:p>
+        </w:tc>
+        <w:tc>
+          <w:tcPr>
+            <w:tcW w:type="dxa" w:w="1704"/>
+            <w:tcMar>
+              <w:top w:w="60" w:type="dxa"/>
+              <w:bottom w:w="60" w:type="dxa"/>
+              <w:left w:w="80" w:type="dxa"/>
+              <w:right w:w="80" w:type="dxa"/>
+            </w:tcMar>
+          </w:tcPr>
+          <w:p>
+            <w:pPr>
+              <w:spacing w:line="252" w:lineRule="auto"/>
+            </w:pPr>
+            <w:r>
+              <w:rPr>
+                <w:sz w:val="17"/>
+              </w:rPr>
+              <w:t>Robu.in courier rate</w:t>
+            </w:r>
+          </w:p>
+        </w:tc>
+      </w:tr>
+      <w:tr>
+        <w:tc>
+          <w:tcPr>
+            <w:tcW w:type="dxa" w:w="1704"/>
+            <w:shd w:fill="E0E7FF"/>
+            <w:tcMar>
+              <w:top w:w="60" w:type="dxa"/>
+              <w:bottom w:w="60" w:type="dxa"/>
+              <w:left w:w="80" w:type="dxa"/>
+              <w:right w:w="80" w:type="dxa"/>
+            </w:tcMar>
+          </w:tcPr>
+          <w:p>
+            <w:pPr>
+              <w:spacing w:line="252" w:lineRule="auto"/>
+            </w:pPr>
+            <w:r>
+              <w:rPr>
+                <w:b/>
+                <w:sz w:val="17"/>
+              </w:rPr>
+              <w:t>PART 2: REQUIRED ONLY IF WE USE DRONE</w:t>
+            </w:r>
+          </w:p>
+        </w:tc>
+        <w:tc>
+          <w:tcPr>
+            <w:tcW w:type="dxa" w:w="1704"/>
+            <w:shd w:fill="E0E7FF"/>
+            <w:tcMar>
+              <w:top w:w="60" w:type="dxa"/>
+              <w:bottom w:w="60" w:type="dxa"/>
+              <w:left w:w="80" w:type="dxa"/>
+              <w:right w:w="80" w:type="dxa"/>
+            </w:tcMar>
+          </w:tcPr>
+          <w:p>
+            <w:pPr>
+              <w:spacing w:line="252" w:lineRule="auto"/>
+            </w:pPr>
+            <w:r>
+              <w:rPr>
+                <w:b/>
+                <w:sz w:val="17"/>
+              </w:rPr>
+              <w:t>DRONE ONLY</w:t>
+            </w:r>
+          </w:p>
+        </w:tc>
+        <w:tc>
+          <w:tcPr>
+            <w:tcW w:type="dxa" w:w="1704"/>
+            <w:shd w:fill="E0E7FF"/>
+            <w:tcMar>
+              <w:top w:w="60" w:type="dxa"/>
+              <w:bottom w:w="60" w:type="dxa"/>
+              <w:left w:w="80" w:type="dxa"/>
+              <w:right w:w="80" w:type="dxa"/>
+            </w:tcMar>
+          </w:tcPr>
+          <w:p>
+            <w:pPr>
+              <w:spacing w:line="252" w:lineRule="auto"/>
+            </w:pPr>
+            <w:r>
+              <w:rPr>
+                <w:b/>
+                <w:sz w:val="17"/>
+              </w:rPr>
+              <w:t>--</w:t>
+            </w:r>
+          </w:p>
+        </w:tc>
+        <w:tc>
+          <w:tcPr>
+            <w:tcW w:type="dxa" w:w="1704"/>
+            <w:shd w:fill="E0E7FF"/>
+            <w:tcMar>
+              <w:top w:w="60" w:type="dxa"/>
+              <w:bottom w:w="60" w:type="dxa"/>
+              <w:left w:w="80" w:type="dxa"/>
+              <w:right w:w="80" w:type="dxa"/>
+            </w:tcMar>
+          </w:tcPr>
+          <w:p>
+            <w:pPr>
+              <w:spacing w:line="252" w:lineRule="auto"/>
+            </w:pPr>
+            <w:r>
+              <w:rPr>
+                <w:b/>
+                <w:sz w:val="17"/>
+              </w:rPr>
+              <w:t>--</w:t>
+            </w:r>
+          </w:p>
+        </w:tc>
+        <w:tc>
+          <w:tcPr>
+            <w:tcW w:type="dxa" w:w="1704"/>
+            <w:shd w:fill="E0E7FF"/>
+            <w:tcMar>
+              <w:top w:w="60" w:type="dxa"/>
+              <w:bottom w:w="60" w:type="dxa"/>
+              <w:left w:w="80" w:type="dxa"/>
+              <w:right w:w="80" w:type="dxa"/>
+            </w:tcMar>
+          </w:tcPr>
+          <w:p>
+            <w:pPr>
+              <w:spacing w:line="252" w:lineRule="auto"/>
+            </w:pPr>
+            <w:r>
+              <w:rPr>
+                <w:b/>
+                <w:sz w:val="17"/>
+              </w:rPr>
+              <w:t>17,350.00</w:t>
+            </w:r>
+          </w:p>
+        </w:tc>
+        <w:tc>
+          <w:tcPr>
+            <w:tcW w:type="dxa" w:w="1704"/>
+            <w:shd w:fill="E0E7FF"/>
+            <w:tcMar>
+              <w:top w:w="60" w:type="dxa"/>
+              <w:bottom w:w="60" w:type="dxa"/>
+              <w:left w:w="80" w:type="dxa"/>
+              <w:right w:w="80" w:type="dxa"/>
+            </w:tcMar>
+          </w:tcPr>
+          <w:p>
+            <w:pPr>
+              <w:spacing w:line="252" w:lineRule="auto"/>
+            </w:pPr>
+            <w:r>
+              <w:rPr>
+                <w:b/>
+                <w:sz w:val="17"/>
+              </w:rPr>
+              <w:t>Exterior Facade Flight</w:t>
+            </w:r>
+          </w:p>
+        </w:tc>
+      </w:tr>
+      <w:tr>
+        <w:tc>
+          <w:tcPr>
+            <w:tcW w:type="dxa" w:w="1704"/>
+            <w:tcMar>
+              <w:top w:w="60" w:type="dxa"/>
+              <w:bottom w:w="60" w:type="dxa"/>
+              <w:left w:w="80" w:type="dxa"/>
+              <w:right w:w="80" w:type="dxa"/>
+            </w:tcMar>
+          </w:tcPr>
+          <w:p>
+            <w:pPr>
+              <w:spacing w:line="252" w:lineRule="auto"/>
+            </w:pPr>
+            <w:r>
+              <w:rPr>
+                <w:b/>
+                <w:sz w:val="17"/>
+              </w:rPr>
+              <w:t>F450 Quadcopter Drone Frame Kit + Landing Gear</w:t>
+            </w:r>
+          </w:p>
+        </w:tc>
+        <w:tc>
+          <w:tcPr>
+            <w:tcW w:type="dxa" w:w="1704"/>
+            <w:tcMar>
+              <w:top w:w="60" w:type="dxa"/>
+              <w:bottom w:w="60" w:type="dxa"/>
+              <w:left w:w="80" w:type="dxa"/>
+              <w:right w:w="80" w:type="dxa"/>
+            </w:tcMar>
+          </w:tcPr>
+          <w:p>
+            <w:pPr>
+              <w:spacing w:line="252" w:lineRule="auto"/>
+            </w:pPr>
+            <w:r>
+              <w:rPr>
+                <w:sz w:val="17"/>
+              </w:rPr>
+              <w:t>Drone Only</w:t>
+            </w:r>
+          </w:p>
+        </w:tc>
+        <w:tc>
+          <w:tcPr>
+            <w:tcW w:type="dxa" w:w="1704"/>
+            <w:tcMar>
+              <w:top w:w="60" w:type="dxa"/>
+              <w:bottom w:w="60" w:type="dxa"/>
+              <w:left w:w="80" w:type="dxa"/>
+              <w:right w:w="80" w:type="dxa"/>
+            </w:tcMar>
+          </w:tcPr>
+          <w:p>
+            <w:pPr>
+              <w:spacing w:line="252" w:lineRule="auto"/>
+            </w:pPr>
+            <w:r>
+              <w:rPr>
+                <w:sz w:val="17"/>
+              </w:rPr>
+              <w:t>1</w:t>
+            </w:r>
+          </w:p>
+        </w:tc>
+        <w:tc>
+          <w:tcPr>
+            <w:tcW w:type="dxa" w:w="1704"/>
+            <w:tcMar>
+              <w:top w:w="60" w:type="dxa"/>
+              <w:bottom w:w="60" w:type="dxa"/>
+              <w:left w:w="80" w:type="dxa"/>
+              <w:right w:w="80" w:type="dxa"/>
+            </w:tcMar>
+          </w:tcPr>
+          <w:p>
+            <w:pPr>
+              <w:spacing w:line="252" w:lineRule="auto"/>
+            </w:pPr>
+            <w:r>
+              <w:rPr>
+                <w:sz w:val="17"/>
+              </w:rPr>
+              <w:t>1,350.00</w:t>
+            </w:r>
+          </w:p>
+        </w:tc>
+        <w:tc>
+          <w:tcPr>
+            <w:tcW w:type="dxa" w:w="1704"/>
+            <w:tcMar>
+              <w:top w:w="60" w:type="dxa"/>
+              <w:bottom w:w="60" w:type="dxa"/>
+              <w:left w:w="80" w:type="dxa"/>
+              <w:right w:w="80" w:type="dxa"/>
+            </w:tcMar>
+          </w:tcPr>
+          <w:p>
+            <w:pPr>
+              <w:spacing w:line="252" w:lineRule="auto"/>
+            </w:pPr>
+            <w:r>
+              <w:rPr>
+                <w:b/>
+                <w:sz w:val="17"/>
+              </w:rPr>
+              <w:t>1,350.00</w:t>
+            </w:r>
+          </w:p>
+        </w:tc>
+        <w:tc>
+          <w:tcPr>
+            <w:tcW w:type="dxa" w:w="1704"/>
+            <w:tcMar>
+              <w:top w:w="60" w:type="dxa"/>
+              <w:bottom w:w="60" w:type="dxa"/>
+              <w:left w:w="80" w:type="dxa"/>
+              <w:right w:w="80" w:type="dxa"/>
+            </w:tcMar>
+          </w:tcPr>
+          <w:p>
+            <w:pPr>
+              <w:spacing w:line="252" w:lineRule="auto"/>
+            </w:pPr>
+            <w:r>
+              <w:rPr>
+                <w:sz w:val="17"/>
+              </w:rPr>
+              <w:t>Robu.in / QuartzComponents</w:t>
+            </w:r>
+          </w:p>
+        </w:tc>
+      </w:tr>
+      <w:tr>
+        <w:tc>
+          <w:tcPr>
+            <w:tcW w:type="dxa" w:w="1704"/>
             <w:tcMar>
               <w:top w:w="60" w:type="dxa"/>
               <w:bottom w:w="60" w:type="dxa"/>
@@ -2852,7 +3495,7 @@
         </w:tc>
         <w:tc>
           <w:tcPr>
-            <w:tcW w:type="dxa" w:w="1461"/>
+            <w:tcW w:type="dxa" w:w="1704"/>
             <w:tcMar>
               <w:top w:w="60" w:type="dxa"/>
               <w:bottom w:w="60" w:type="dxa"/>
@@ -2868,13 +3511,13 @@
               <w:rPr>
                 <w:sz w:val="17"/>
               </w:rPr>
-              <w:t>Propulsion</w:t>
+              <w:t>Drone Only</w:t>
             </w:r>
           </w:p>
         </w:tc>
         <w:tc>
           <w:tcPr>
-            <w:tcW w:type="dxa" w:w="1461"/>
+            <w:tcW w:type="dxa" w:w="1704"/>
             <w:tcMar>
               <w:top w:w="60" w:type="dxa"/>
               <w:bottom w:w="60" w:type="dxa"/>
@@ -2896,29 +3539,7 @@
         </w:tc>
         <w:tc>
           <w:tcPr>
-            <w:tcW w:type="dxa" w:w="1461"/>
-            <w:tcMar>
-              <w:top w:w="60" w:type="dxa"/>
-              <w:bottom w:w="60" w:type="dxa"/>
-              <w:left w:w="80" w:type="dxa"/>
-              <w:right w:w="80" w:type="dxa"/>
-            </w:tcMar>
-          </w:tcPr>
-          <w:p>
-            <w:pPr>
-              <w:spacing w:line="252" w:lineRule="auto"/>
-            </w:pPr>
-            <w:r>
-              <w:rPr>
-                <w:sz w:val="17"/>
-              </w:rPr>
-              <w:t>2,200.00</w:t>
-            </w:r>
-          </w:p>
-        </w:tc>
-        <w:tc>
-          <w:tcPr>
-            <w:tcW w:type="dxa" w:w="1461"/>
+            <w:tcW w:type="dxa" w:w="1704"/>
             <w:tcMar>
               <w:top w:w="60" w:type="dxa"/>
               <w:bottom w:w="60" w:type="dxa"/>
@@ -2940,7 +3561,7 @@
         </w:tc>
         <w:tc>
           <w:tcPr>
-            <w:tcW w:type="dxa" w:w="1461"/>
+            <w:tcW w:type="dxa" w:w="1704"/>
             <w:tcMar>
               <w:top w:w="60" w:type="dxa"/>
               <w:bottom w:w="60" w:type="dxa"/>
@@ -2963,7 +3584,7 @@
         </w:tc>
         <w:tc>
           <w:tcPr>
-            <w:tcW w:type="dxa" w:w="1461"/>
+            <w:tcW w:type="dxa" w:w="1704"/>
             <w:tcMar>
               <w:top w:w="60" w:type="dxa"/>
               <w:bottom w:w="60" w:type="dxa"/>
@@ -2987,7 +3608,7 @@
       <w:tr>
         <w:tc>
           <w:tcPr>
-            <w:tcW w:type="dxa" w:w="1461"/>
+            <w:tcW w:type="dxa" w:w="1704"/>
             <w:tcMar>
               <w:top w:w="60" w:type="dxa"/>
               <w:bottom w:w="60" w:type="dxa"/>
@@ -3010,7 +3631,7 @@
         </w:tc>
         <w:tc>
           <w:tcPr>
-            <w:tcW w:type="dxa" w:w="1461"/>
+            <w:tcW w:type="dxa" w:w="1704"/>
             <w:tcMar>
               <w:top w:w="60" w:type="dxa"/>
               <w:bottom w:w="60" w:type="dxa"/>
@@ -3026,13 +3647,13 @@
               <w:rPr>
                 <w:sz w:val="17"/>
               </w:rPr>
-              <w:t>Propulsion</w:t>
+              <w:t>Drone Only</w:t>
             </w:r>
           </w:p>
         </w:tc>
         <w:tc>
           <w:tcPr>
-            <w:tcW w:type="dxa" w:w="1461"/>
+            <w:tcW w:type="dxa" w:w="1704"/>
             <w:tcMar>
               <w:top w:w="60" w:type="dxa"/>
               <w:bottom w:w="60" w:type="dxa"/>
@@ -3054,29 +3675,7 @@
         </w:tc>
         <w:tc>
           <w:tcPr>
-            <w:tcW w:type="dxa" w:w="1461"/>
-            <w:tcMar>
-              <w:top w:w="60" w:type="dxa"/>
-              <w:bottom w:w="60" w:type="dxa"/>
-              <w:left w:w="80" w:type="dxa"/>
-              <w:right w:w="80" w:type="dxa"/>
-            </w:tcMar>
-          </w:tcPr>
-          <w:p>
-            <w:pPr>
-              <w:spacing w:line="252" w:lineRule="auto"/>
-            </w:pPr>
-            <w:r>
-              <w:rPr>
-                <w:sz w:val="17"/>
-              </w:rPr>
-              <w:t>1,800.00</w:t>
-            </w:r>
-          </w:p>
-        </w:tc>
-        <w:tc>
-          <w:tcPr>
-            <w:tcW w:type="dxa" w:w="1461"/>
+            <w:tcW w:type="dxa" w:w="1704"/>
             <w:tcMar>
               <w:top w:w="60" w:type="dxa"/>
               <w:bottom w:w="60" w:type="dxa"/>
@@ -3098,7 +3697,7 @@
         </w:tc>
         <w:tc>
           <w:tcPr>
-            <w:tcW w:type="dxa" w:w="1461"/>
+            <w:tcW w:type="dxa" w:w="1704"/>
             <w:tcMar>
               <w:top w:w="60" w:type="dxa"/>
               <w:bottom w:w="60" w:type="dxa"/>
@@ -3121,7 +3720,7 @@
         </w:tc>
         <w:tc>
           <w:tcPr>
-            <w:tcW w:type="dxa" w:w="1461"/>
+            <w:tcW w:type="dxa" w:w="1704"/>
             <w:tcMar>
               <w:top w:w="60" w:type="dxa"/>
               <w:bottom w:w="60" w:type="dxa"/>
@@ -3145,7 +3744,7 @@
       <w:tr>
         <w:tc>
           <w:tcPr>
-            <w:tcW w:type="dxa" w:w="1461"/>
+            <w:tcW w:type="dxa" w:w="1704"/>
             <w:tcMar>
               <w:top w:w="60" w:type="dxa"/>
               <w:bottom w:w="60" w:type="dxa"/>
@@ -3168,7 +3767,7 @@
         </w:tc>
         <w:tc>
           <w:tcPr>
-            <w:tcW w:type="dxa" w:w="1461"/>
+            <w:tcW w:type="dxa" w:w="1704"/>
             <w:tcMar>
               <w:top w:w="60" w:type="dxa"/>
               <w:bottom w:w="60" w:type="dxa"/>
@@ -3184,13 +3783,13 @@
               <w:rPr>
                 <w:sz w:val="17"/>
               </w:rPr>
-              <w:t>Propulsion</w:t>
+              <w:t>Drone Only</w:t>
             </w:r>
           </w:p>
         </w:tc>
         <w:tc>
           <w:tcPr>
-            <w:tcW w:type="dxa" w:w="1461"/>
+            <w:tcW w:type="dxa" w:w="1704"/>
             <w:tcMar>
               <w:top w:w="60" w:type="dxa"/>
               <w:bottom w:w="60" w:type="dxa"/>
@@ -3212,7 +3811,7 @@
         </w:tc>
         <w:tc>
           <w:tcPr>
-            <w:tcW w:type="dxa" w:w="1461"/>
+            <w:tcW w:type="dxa" w:w="1704"/>
             <w:tcMar>
               <w:top w:w="60" w:type="dxa"/>
               <w:bottom w:w="60" w:type="dxa"/>
@@ -3228,35 +3827,13 @@
               <w:rPr>
                 <w:sz w:val="17"/>
               </w:rPr>
-              <w:t>280.00</w:t>
+              <w:t>130.00</w:t>
             </w:r>
           </w:p>
         </w:tc>
         <w:tc>
           <w:tcPr>
-            <w:tcW w:type="dxa" w:w="1461"/>
-            <w:tcMar>
-              <w:top w:w="60" w:type="dxa"/>
-              <w:bottom w:w="60" w:type="dxa"/>
-              <w:left w:w="80" w:type="dxa"/>
-              <w:right w:w="80" w:type="dxa"/>
-            </w:tcMar>
-          </w:tcPr>
-          <w:p>
-            <w:pPr>
-              <w:spacing w:line="252" w:lineRule="auto"/>
-            </w:pPr>
-            <w:r>
-              <w:rPr>
-                <w:sz w:val="17"/>
-              </w:rPr>
-              <w:t>260.00</w:t>
-            </w:r>
-          </w:p>
-        </w:tc>
-        <w:tc>
-          <w:tcPr>
-            <w:tcW w:type="dxa" w:w="1461"/>
+            <w:tcW w:type="dxa" w:w="1704"/>
             <w:tcMar>
               <w:top w:w="60" w:type="dxa"/>
               <w:bottom w:w="60" w:type="dxa"/>
@@ -3279,7 +3856,7 @@
         </w:tc>
         <w:tc>
           <w:tcPr>
-            <w:tcW w:type="dxa" w:w="1461"/>
+            <w:tcW w:type="dxa" w:w="1704"/>
             <w:tcMar>
               <w:top w:w="60" w:type="dxa"/>
               <w:bottom w:w="60" w:type="dxa"/>
@@ -3303,7 +3880,7 @@
       <w:tr>
         <w:tc>
           <w:tcPr>
-            <w:tcW w:type="dxa" w:w="1461"/>
+            <w:tcW w:type="dxa" w:w="1704"/>
             <w:tcMar>
               <w:top w:w="60" w:type="dxa"/>
               <w:bottom w:w="60" w:type="dxa"/>
@@ -3320,13 +3897,13 @@
                 <w:b/>
                 <w:sz w:val="17"/>
               </w:rPr>
-              <w:t>Orange 3S 11.1V 4200mAh 30C LiPo Battery</w:t>
+              <w:t>Orange 3S 11.1V 4200mAh 30C LiPo Battery Pack</w:t>
             </w:r>
           </w:p>
         </w:tc>
         <w:tc>
           <w:tcPr>
-            <w:tcW w:type="dxa" w:w="1461"/>
+            <w:tcW w:type="dxa" w:w="1704"/>
             <w:tcMar>
               <w:top w:w="60" w:type="dxa"/>
               <w:bottom w:w="60" w:type="dxa"/>
@@ -3342,13 +3919,13 @@
               <w:rPr>
                 <w:sz w:val="17"/>
               </w:rPr>
-              <w:t>Power Storage</w:t>
+              <w:t>Drone Only</w:t>
             </w:r>
           </w:p>
         </w:tc>
         <w:tc>
           <w:tcPr>
-            <w:tcW w:type="dxa" w:w="1461"/>
+            <w:tcW w:type="dxa" w:w="1704"/>
             <w:tcMar>
               <w:top w:w="60" w:type="dxa"/>
               <w:bottom w:w="60" w:type="dxa"/>
@@ -3370,29 +3947,7 @@
         </w:tc>
         <w:tc>
           <w:tcPr>
-            <w:tcW w:type="dxa" w:w="1461"/>
-            <w:tcMar>
-              <w:top w:w="60" w:type="dxa"/>
-              <w:bottom w:w="60" w:type="dxa"/>
-              <w:left w:w="80" w:type="dxa"/>
-              <w:right w:w="80" w:type="dxa"/>
-            </w:tcMar>
-          </w:tcPr>
-          <w:p>
-            <w:pPr>
-              <w:spacing w:line="252" w:lineRule="auto"/>
-            </w:pPr>
-            <w:r>
-              <w:rPr>
-                <w:sz w:val="17"/>
-              </w:rPr>
-              <w:t>2,950.00</w:t>
-            </w:r>
-          </w:p>
-        </w:tc>
-        <w:tc>
-          <w:tcPr>
-            <w:tcW w:type="dxa" w:w="1461"/>
+            <w:tcW w:type="dxa" w:w="1704"/>
             <w:tcMar>
               <w:top w:w="60" w:type="dxa"/>
               <w:bottom w:w="60" w:type="dxa"/>
@@ -3414,7 +3969,7 @@
         </w:tc>
         <w:tc>
           <w:tcPr>
-            <w:tcW w:type="dxa" w:w="1461"/>
+            <w:tcW w:type="dxa" w:w="1704"/>
             <w:tcMar>
               <w:top w:w="60" w:type="dxa"/>
               <w:bottom w:w="60" w:type="dxa"/>
@@ -3437,7 +3992,7 @@
         </w:tc>
         <w:tc>
           <w:tcPr>
-            <w:tcW w:type="dxa" w:w="1461"/>
+            <w:tcW w:type="dxa" w:w="1704"/>
             <w:tcMar>
               <w:top w:w="60" w:type="dxa"/>
               <w:bottom w:w="60" w:type="dxa"/>
@@ -3461,7 +4016,7 @@
       <w:tr>
         <w:tc>
           <w:tcPr>
-            <w:tcW w:type="dxa" w:w="1461"/>
+            <w:tcW w:type="dxa" w:w="1704"/>
             <w:tcMar>
               <w:top w:w="60" w:type="dxa"/>
               <w:bottom w:w="60" w:type="dxa"/>
@@ -3478,13 +4033,13 @@
                 <w:b/>
                 <w:sz w:val="17"/>
               </w:rPr>
-              <w:t>iMAX B6 80W LiPo Balance Charger + Adapter</w:t>
+              <w:t>iMAX B6 80W LiPo Digital Balance Charger + Adapter</w:t>
             </w:r>
           </w:p>
         </w:tc>
         <w:tc>
           <w:tcPr>
-            <w:tcW w:type="dxa" w:w="1461"/>
+            <w:tcW w:type="dxa" w:w="1704"/>
             <w:tcMar>
               <w:top w:w="60" w:type="dxa"/>
               <w:bottom w:w="60" w:type="dxa"/>
@@ -3500,13 +4055,13 @@
               <w:rPr>
                 <w:sz w:val="17"/>
               </w:rPr>
-              <w:t>Power Equipment</w:t>
+              <w:t>Drone Only</w:t>
             </w:r>
           </w:p>
         </w:tc>
         <w:tc>
           <w:tcPr>
-            <w:tcW w:type="dxa" w:w="1461"/>
+            <w:tcW w:type="dxa" w:w="1704"/>
             <w:tcMar>
               <w:top w:w="60" w:type="dxa"/>
               <w:bottom w:w="60" w:type="dxa"/>
@@ -3528,29 +4083,7 @@
         </w:tc>
         <w:tc>
           <w:tcPr>
-            <w:tcW w:type="dxa" w:w="1461"/>
-            <w:tcMar>
-              <w:top w:w="60" w:type="dxa"/>
-              <w:bottom w:w="60" w:type="dxa"/>
-              <w:left w:w="80" w:type="dxa"/>
-              <w:right w:w="80" w:type="dxa"/>
-            </w:tcMar>
-          </w:tcPr>
-          <w:p>
-            <w:pPr>
-              <w:spacing w:line="252" w:lineRule="auto"/>
-            </w:pPr>
-            <w:r>
-              <w:rPr>
-                <w:sz w:val="17"/>
-              </w:rPr>
-              <w:t>1,650.00</w:t>
-            </w:r>
-          </w:p>
-        </w:tc>
-        <w:tc>
-          <w:tcPr>
-            <w:tcW w:type="dxa" w:w="1461"/>
+            <w:tcW w:type="dxa" w:w="1704"/>
             <w:tcMar>
               <w:top w:w="60" w:type="dxa"/>
               <w:bottom w:w="60" w:type="dxa"/>
@@ -3572,7 +4105,7 @@
         </w:tc>
         <w:tc>
           <w:tcPr>
-            <w:tcW w:type="dxa" w:w="1461"/>
+            <w:tcW w:type="dxa" w:w="1704"/>
             <w:tcMar>
               <w:top w:w="60" w:type="dxa"/>
               <w:bottom w:w="60" w:type="dxa"/>
@@ -3595,7 +4128,7 @@
         </w:tc>
         <w:tc>
           <w:tcPr>
-            <w:tcW w:type="dxa" w:w="1461"/>
+            <w:tcW w:type="dxa" w:w="1704"/>
             <w:tcMar>
               <w:top w:w="60" w:type="dxa"/>
               <w:bottom w:w="60" w:type="dxa"/>
@@ -3619,7 +4152,7 @@
       <w:tr>
         <w:tc>
           <w:tcPr>
-            <w:tcW w:type="dxa" w:w="1461"/>
+            <w:tcW w:type="dxa" w:w="1704"/>
             <w:tcMar>
               <w:top w:w="60" w:type="dxa"/>
               <w:bottom w:w="60" w:type="dxa"/>
@@ -3636,13 +4169,13 @@
                 <w:b/>
                 <w:sz w:val="17"/>
               </w:rPr>
-              <w:t>Pixhawk 2.4.8 Flight Controller + M8N GPS + Telemetry</w:t>
+              <w:t>Pixhawk 2.4.8 Autopilot + M8N GPS + Telemetry</w:t>
             </w:r>
           </w:p>
         </w:tc>
         <w:tc>
           <w:tcPr>
-            <w:tcW w:type="dxa" w:w="1461"/>
+            <w:tcW w:type="dxa" w:w="1704"/>
             <w:tcMar>
               <w:top w:w="60" w:type="dxa"/>
               <w:bottom w:w="60" w:type="dxa"/>
@@ -3658,13 +4191,13 @@
               <w:rPr>
                 <w:sz w:val="17"/>
               </w:rPr>
-              <w:t>Avionics Autopilot</w:t>
+              <w:t>Drone Only</w:t>
             </w:r>
           </w:p>
         </w:tc>
         <w:tc>
           <w:tcPr>
-            <w:tcW w:type="dxa" w:w="1461"/>
+            <w:tcW w:type="dxa" w:w="1704"/>
             <w:tcMar>
               <w:top w:w="60" w:type="dxa"/>
               <w:bottom w:w="60" w:type="dxa"/>
@@ -3686,29 +4219,7 @@
         </w:tc>
         <w:tc>
           <w:tcPr>
-            <w:tcW w:type="dxa" w:w="1461"/>
-            <w:tcMar>
-              <w:top w:w="60" w:type="dxa"/>
-              <w:bottom w:w="60" w:type="dxa"/>
-              <w:left w:w="80" w:type="dxa"/>
-              <w:right w:w="80" w:type="dxa"/>
-            </w:tcMar>
-          </w:tcPr>
-          <w:p>
-            <w:pPr>
-              <w:spacing w:line="252" w:lineRule="auto"/>
-            </w:pPr>
-            <w:r>
-              <w:rPr>
-                <w:sz w:val="17"/>
-              </w:rPr>
-              <w:t>6,200.00</w:t>
-            </w:r>
-          </w:p>
-        </w:tc>
-        <w:tc>
-          <w:tcPr>
-            <w:tcW w:type="dxa" w:w="1461"/>
+            <w:tcW w:type="dxa" w:w="1704"/>
             <w:tcMar>
               <w:top w:w="60" w:type="dxa"/>
               <w:bottom w:w="60" w:type="dxa"/>
@@ -3730,7 +4241,7 @@
         </w:tc>
         <w:tc>
           <w:tcPr>
-            <w:tcW w:type="dxa" w:w="1461"/>
+            <w:tcW w:type="dxa" w:w="1704"/>
             <w:tcMar>
               <w:top w:w="60" w:type="dxa"/>
               <w:bottom w:w="60" w:type="dxa"/>
@@ -3753,7 +4264,7 @@
         </w:tc>
         <w:tc>
           <w:tcPr>
-            <w:tcW w:type="dxa" w:w="1461"/>
+            <w:tcW w:type="dxa" w:w="1704"/>
             <w:tcMar>
               <w:top w:w="60" w:type="dxa"/>
               <w:bottom w:w="60" w:type="dxa"/>
@@ -3777,7 +4288,7 @@
       <w:tr>
         <w:tc>
           <w:tcPr>
-            <w:tcW w:type="dxa" w:w="1461"/>
+            <w:tcW w:type="dxa" w:w="1704"/>
             <w:tcMar>
               <w:top w:w="60" w:type="dxa"/>
               <w:bottom w:w="60" w:type="dxa"/>
@@ -3794,13 +4305,13 @@
                 <w:b/>
                 <w:sz w:val="17"/>
               </w:rPr>
-              <w:t>ESP32-WROOM-32 Development Board</w:t>
+              <w:t>Silicone Ball Vibration Damper Mounts for Pixhawk/LiDAR</w:t>
             </w:r>
           </w:p>
         </w:tc>
         <w:tc>
           <w:tcPr>
-            <w:tcW w:type="dxa" w:w="1461"/>
+            <w:tcW w:type="dxa" w:w="1704"/>
             <w:tcMar>
               <w:top w:w="60" w:type="dxa"/>
               <w:bottom w:w="60" w:type="dxa"/>
@@ -3816,13 +4327,13 @@
               <w:rPr>
                 <w:sz w:val="17"/>
               </w:rPr>
-              <w:t>Embedded MCU</w:t>
+              <w:t>Drone Only</w:t>
             </w:r>
           </w:p>
         </w:tc>
         <w:tc>
           <w:tcPr>
-            <w:tcW w:type="dxa" w:w="1461"/>
+            <w:tcW w:type="dxa" w:w="1704"/>
             <w:tcMar>
               <w:top w:w="60" w:type="dxa"/>
               <w:bottom w:w="60" w:type="dxa"/>
@@ -3838,13 +4349,13 @@
               <w:rPr>
                 <w:sz w:val="17"/>
               </w:rPr>
-              <w:t>1</w:t>
+              <w:t>1 set</w:t>
             </w:r>
           </w:p>
         </w:tc>
         <w:tc>
           <w:tcPr>
-            <w:tcW w:type="dxa" w:w="1461"/>
+            <w:tcW w:type="dxa" w:w="1704"/>
             <w:tcMar>
               <w:top w:w="60" w:type="dxa"/>
               <w:bottom w:w="60" w:type="dxa"/>
@@ -3860,35 +4371,13 @@
               <w:rPr>
                 <w:sz w:val="17"/>
               </w:rPr>
-              <w:t>420.00</w:t>
+              <w:t>250.00</w:t>
             </w:r>
           </w:p>
         </w:tc>
         <w:tc>
           <w:tcPr>
-            <w:tcW w:type="dxa" w:w="1461"/>
-            <w:tcMar>
-              <w:top w:w="60" w:type="dxa"/>
-              <w:bottom w:w="60" w:type="dxa"/>
-              <w:left w:w="80" w:type="dxa"/>
-              <w:right w:w="80" w:type="dxa"/>
-            </w:tcMar>
-          </w:tcPr>
-          <w:p>
-            <w:pPr>
-              <w:spacing w:line="252" w:lineRule="auto"/>
-            </w:pPr>
-            <w:r>
-              <w:rPr>
-                <w:sz w:val="17"/>
-              </w:rPr>
-              <w:t>380.00</w:t>
-            </w:r>
-          </w:p>
-        </w:tc>
-        <w:tc>
-          <w:tcPr>
-            <w:tcW w:type="dxa" w:w="1461"/>
+            <w:tcW w:type="dxa" w:w="1704"/>
             <w:tcMar>
               <w:top w:w="60" w:type="dxa"/>
               <w:bottom w:w="60" w:type="dxa"/>
@@ -3905,13 +4394,13 @@
                 <w:b/>
                 <w:sz w:val="17"/>
               </w:rPr>
-              <w:t>380.00</w:t>
+              <w:t>250.00</w:t>
             </w:r>
           </w:p>
         </w:tc>
         <w:tc>
           <w:tcPr>
-            <w:tcW w:type="dxa" w:w="1461"/>
+            <w:tcW w:type="dxa" w:w="1704"/>
             <w:tcMar>
               <w:top w:w="60" w:type="dxa"/>
               <w:bottom w:w="60" w:type="dxa"/>
@@ -3935,7 +4424,7 @@
       <w:tr>
         <w:tc>
           <w:tcPr>
-            <w:tcW w:type="dxa" w:w="1461"/>
+            <w:tcW w:type="dxa" w:w="1704"/>
             <w:tcMar>
               <w:top w:w="60" w:type="dxa"/>
               <w:bottom w:w="60" w:type="dxa"/>
@@ -3952,13 +4441,13 @@
                 <w:b/>
                 <w:sz w:val="17"/>
               </w:rPr>
-              <w:t>LM2596 DC-DC Buck Step-Down Voltage Regulator</w:t>
+              <w:t>Drone Subsystem Engineering Contingency (8%)</w:t>
             </w:r>
           </w:p>
         </w:tc>
         <w:tc>
           <w:tcPr>
-            <w:tcW w:type="dxa" w:w="1461"/>
+            <w:tcW w:type="dxa" w:w="1704"/>
             <w:tcMar>
               <w:top w:w="60" w:type="dxa"/>
               <w:bottom w:w="60" w:type="dxa"/>
@@ -3974,13 +4463,13 @@
               <w:rPr>
                 <w:sz w:val="17"/>
               </w:rPr>
-              <w:t>Power Management</w:t>
+              <w:t>Drone Only</w:t>
             </w:r>
           </w:p>
         </w:tc>
         <w:tc>
           <w:tcPr>
-            <w:tcW w:type="dxa" w:w="1461"/>
+            <w:tcW w:type="dxa" w:w="1704"/>
             <w:tcMar>
               <w:top w:w="60" w:type="dxa"/>
               <w:bottom w:w="60" w:type="dxa"/>
@@ -3996,13 +4485,13 @@
               <w:rPr>
                 <w:sz w:val="17"/>
               </w:rPr>
-              <w:t>2</w:t>
+              <w:t>Reserve</w:t>
             </w:r>
           </w:p>
         </w:tc>
         <w:tc>
           <w:tcPr>
-            <w:tcW w:type="dxa" w:w="1461"/>
+            <w:tcW w:type="dxa" w:w="1704"/>
             <w:tcMar>
               <w:top w:w="60" w:type="dxa"/>
               <w:bottom w:w="60" w:type="dxa"/>
@@ -4018,35 +4507,13 @@
               <w:rPr>
                 <w:sz w:val="17"/>
               </w:rPr>
-              <w:t>260.00</w:t>
+              <w:t>--</w:t>
             </w:r>
           </w:p>
         </w:tc>
         <w:tc>
           <w:tcPr>
-            <w:tcW w:type="dxa" w:w="1461"/>
-            <w:tcMar>
-              <w:top w:w="60" w:type="dxa"/>
-              <w:bottom w:w="60" w:type="dxa"/>
-              <w:left w:w="80" w:type="dxa"/>
-              <w:right w:w="80" w:type="dxa"/>
-            </w:tcMar>
-          </w:tcPr>
-          <w:p>
-            <w:pPr>
-              <w:spacing w:line="252" w:lineRule="auto"/>
-            </w:pPr>
-            <w:r>
-              <w:rPr>
-                <w:sz w:val="17"/>
-              </w:rPr>
-              <w:t>240.00</w:t>
-            </w:r>
-          </w:p>
-        </w:tc>
-        <w:tc>
-          <w:tcPr>
-            <w:tcW w:type="dxa" w:w="1461"/>
+            <w:tcW w:type="dxa" w:w="1704"/>
             <w:tcMar>
               <w:top w:w="60" w:type="dxa"/>
               <w:bottom w:w="60" w:type="dxa"/>
@@ -4063,13 +4530,295 @@
                 <w:b/>
                 <w:sz w:val="17"/>
               </w:rPr>
-              <w:t>240.00</w:t>
+              <w:t>1,260.00</w:t>
             </w:r>
           </w:p>
         </w:tc>
         <w:tc>
           <w:tcPr>
-            <w:tcW w:type="dxa" w:w="1461"/>
+            <w:tcW w:type="dxa" w:w="1704"/>
+            <w:tcMar>
+              <w:top w:w="60" w:type="dxa"/>
+              <w:bottom w:w="60" w:type="dxa"/>
+              <w:left w:w="80" w:type="dxa"/>
+              <w:right w:w="80" w:type="dxa"/>
+            </w:tcMar>
+          </w:tcPr>
+          <w:p>
+            <w:pPr>
+              <w:spacing w:line="252" w:lineRule="auto"/>
+            </w:pPr>
+            <w:r>
+              <w:rPr>
+                <w:sz w:val="17"/>
+              </w:rPr>
+              <w:t>Wire/connector replacements</w:t>
+            </w:r>
+          </w:p>
+        </w:tc>
+      </w:tr>
+      <w:tr>
+        <w:tc>
+          <w:tcPr>
+            <w:tcW w:type="dxa" w:w="1704"/>
+            <w:shd w:fill="FEF3C7"/>
+            <w:tcMar>
+              <w:top w:w="60" w:type="dxa"/>
+              <w:bottom w:w="60" w:type="dxa"/>
+              <w:left w:w="80" w:type="dxa"/>
+              <w:right w:w="80" w:type="dxa"/>
+            </w:tcMar>
+          </w:tcPr>
+          <w:p>
+            <w:pPr>
+              <w:spacing w:line="252" w:lineRule="auto"/>
+            </w:pPr>
+            <w:r>
+              <w:rPr>
+                <w:b/>
+                <w:sz w:val="17"/>
+              </w:rPr>
+              <w:t>PART 3: REQUIRED ONLY IF WE USE SMART 4WD CAR</w:t>
+            </w:r>
+          </w:p>
+        </w:tc>
+        <w:tc>
+          <w:tcPr>
+            <w:tcW w:type="dxa" w:w="1704"/>
+            <w:shd w:fill="FEF3C7"/>
+            <w:tcMar>
+              <w:top w:w="60" w:type="dxa"/>
+              <w:bottom w:w="60" w:type="dxa"/>
+              <w:left w:w="80" w:type="dxa"/>
+              <w:right w:w="80" w:type="dxa"/>
+            </w:tcMar>
+          </w:tcPr>
+          <w:p>
+            <w:pPr>
+              <w:spacing w:line="252" w:lineRule="auto"/>
+            </w:pPr>
+            <w:r>
+              <w:rPr>
+                <w:b/>
+                <w:sz w:val="17"/>
+              </w:rPr>
+              <w:t>CAR ONLY</w:t>
+            </w:r>
+          </w:p>
+        </w:tc>
+        <w:tc>
+          <w:tcPr>
+            <w:tcW w:type="dxa" w:w="1704"/>
+            <w:shd w:fill="FEF3C7"/>
+            <w:tcMar>
+              <w:top w:w="60" w:type="dxa"/>
+              <w:bottom w:w="60" w:type="dxa"/>
+              <w:left w:w="80" w:type="dxa"/>
+              <w:right w:w="80" w:type="dxa"/>
+            </w:tcMar>
+          </w:tcPr>
+          <w:p>
+            <w:pPr>
+              <w:spacing w:line="252" w:lineRule="auto"/>
+            </w:pPr>
+            <w:r>
+              <w:rPr>
+                <w:b/>
+                <w:sz w:val="17"/>
+              </w:rPr>
+              <w:t>--</w:t>
+            </w:r>
+          </w:p>
+        </w:tc>
+        <w:tc>
+          <w:tcPr>
+            <w:tcW w:type="dxa" w:w="1704"/>
+            <w:shd w:fill="FEF3C7"/>
+            <w:tcMar>
+              <w:top w:w="60" w:type="dxa"/>
+              <w:bottom w:w="60" w:type="dxa"/>
+              <w:left w:w="80" w:type="dxa"/>
+              <w:right w:w="80" w:type="dxa"/>
+            </w:tcMar>
+          </w:tcPr>
+          <w:p>
+            <w:pPr>
+              <w:spacing w:line="252" w:lineRule="auto"/>
+            </w:pPr>
+            <w:r>
+              <w:rPr>
+                <w:b/>
+                <w:sz w:val="17"/>
+              </w:rPr>
+              <w:t>--</w:t>
+            </w:r>
+          </w:p>
+        </w:tc>
+        <w:tc>
+          <w:tcPr>
+            <w:tcW w:type="dxa" w:w="1704"/>
+            <w:shd w:fill="FEF3C7"/>
+            <w:tcMar>
+              <w:top w:w="60" w:type="dxa"/>
+              <w:bottom w:w="60" w:type="dxa"/>
+              <w:left w:w="80" w:type="dxa"/>
+              <w:right w:w="80" w:type="dxa"/>
+            </w:tcMar>
+          </w:tcPr>
+          <w:p>
+            <w:pPr>
+              <w:spacing w:line="252" w:lineRule="auto"/>
+            </w:pPr>
+            <w:r>
+              <w:rPr>
+                <w:b/>
+                <w:sz w:val="17"/>
+              </w:rPr>
+              <w:t>3,830.00</w:t>
+            </w:r>
+          </w:p>
+        </w:tc>
+        <w:tc>
+          <w:tcPr>
+            <w:tcW w:type="dxa" w:w="1704"/>
+            <w:shd w:fill="FEF3C7"/>
+            <w:tcMar>
+              <w:top w:w="60" w:type="dxa"/>
+              <w:bottom w:w="60" w:type="dxa"/>
+              <w:left w:w="80" w:type="dxa"/>
+              <w:right w:w="80" w:type="dxa"/>
+            </w:tcMar>
+          </w:tcPr>
+          <w:p>
+            <w:pPr>
+              <w:spacing w:line="252" w:lineRule="auto"/>
+            </w:pPr>
+            <w:r>
+              <w:rPr>
+                <w:b/>
+                <w:sz w:val="17"/>
+              </w:rPr>
+              <w:t>Indoor Corridor Scanning</w:t>
+            </w:r>
+          </w:p>
+        </w:tc>
+      </w:tr>
+      <w:tr>
+        <w:tc>
+          <w:tcPr>
+            <w:tcW w:type="dxa" w:w="1704"/>
+            <w:tcMar>
+              <w:top w:w="60" w:type="dxa"/>
+              <w:bottom w:w="60" w:type="dxa"/>
+              <w:left w:w="80" w:type="dxa"/>
+              <w:right w:w="80" w:type="dxa"/>
+            </w:tcMar>
+          </w:tcPr>
+          <w:p>
+            <w:pPr>
+              <w:spacing w:line="252" w:lineRule="auto"/>
+            </w:pPr>
+            <w:r>
+              <w:rPr>
+                <w:b/>
+                <w:sz w:val="17"/>
+              </w:rPr>
+              <w:t>Smart 4WD High-Traction Chassis + 4x 1:48 Motors &amp; Wheels</w:t>
+            </w:r>
+          </w:p>
+        </w:tc>
+        <w:tc>
+          <w:tcPr>
+            <w:tcW w:type="dxa" w:w="1704"/>
+            <w:tcMar>
+              <w:top w:w="60" w:type="dxa"/>
+              <w:bottom w:w="60" w:type="dxa"/>
+              <w:left w:w="80" w:type="dxa"/>
+              <w:right w:w="80" w:type="dxa"/>
+            </w:tcMar>
+          </w:tcPr>
+          <w:p>
+            <w:pPr>
+              <w:spacing w:line="252" w:lineRule="auto"/>
+            </w:pPr>
+            <w:r>
+              <w:rPr>
+                <w:sz w:val="17"/>
+              </w:rPr>
+              <w:t>Car Only</w:t>
+            </w:r>
+          </w:p>
+        </w:tc>
+        <w:tc>
+          <w:tcPr>
+            <w:tcW w:type="dxa" w:w="1704"/>
+            <w:tcMar>
+              <w:top w:w="60" w:type="dxa"/>
+              <w:bottom w:w="60" w:type="dxa"/>
+              <w:left w:w="80" w:type="dxa"/>
+              <w:right w:w="80" w:type="dxa"/>
+            </w:tcMar>
+          </w:tcPr>
+          <w:p>
+            <w:pPr>
+              <w:spacing w:line="252" w:lineRule="auto"/>
+            </w:pPr>
+            <w:r>
+              <w:rPr>
+                <w:sz w:val="17"/>
+              </w:rPr>
+              <w:t>1 kit</w:t>
+            </w:r>
+          </w:p>
+        </w:tc>
+        <w:tc>
+          <w:tcPr>
+            <w:tcW w:type="dxa" w:w="1704"/>
+            <w:tcMar>
+              <w:top w:w="60" w:type="dxa"/>
+              <w:bottom w:w="60" w:type="dxa"/>
+              <w:left w:w="80" w:type="dxa"/>
+              <w:right w:w="80" w:type="dxa"/>
+            </w:tcMar>
+          </w:tcPr>
+          <w:p>
+            <w:pPr>
+              <w:spacing w:line="252" w:lineRule="auto"/>
+            </w:pPr>
+            <w:r>
+              <w:rPr>
+                <w:sz w:val="17"/>
+              </w:rPr>
+              <w:t>1,050.00</w:t>
+            </w:r>
+          </w:p>
+        </w:tc>
+        <w:tc>
+          <w:tcPr>
+            <w:tcW w:type="dxa" w:w="1704"/>
+            <w:tcMar>
+              <w:top w:w="60" w:type="dxa"/>
+              <w:bottom w:w="60" w:type="dxa"/>
+              <w:left w:w="80" w:type="dxa"/>
+              <w:right w:w="80" w:type="dxa"/>
+            </w:tcMar>
+          </w:tcPr>
+          <w:p>
+            <w:pPr>
+              <w:spacing w:line="252" w:lineRule="auto"/>
+            </w:pPr>
+            <w:r>
+              <w:rPr>
+                <w:b/>
+                <w:sz w:val="17"/>
+              </w:rPr>
+              <w:t>1,050.00</w:t>
+            </w:r>
+          </w:p>
+        </w:tc>
+        <w:tc>
+          <w:tcPr>
+            <w:tcW w:type="dxa" w:w="1704"/>
             <w:tcMar>
               <w:top w:w="60" w:type="dxa"/>
               <w:bottom w:w="60" w:type="dxa"/>
@@ -4093,7 +4842,7 @@
       <w:tr>
         <w:tc>
           <w:tcPr>
-            <w:tcW w:type="dxa" w:w="1461"/>
+            <w:tcW w:type="dxa" w:w="1704"/>
             <w:tcMar>
               <w:top w:w="60" w:type="dxa"/>
               <w:bottom w:w="60" w:type="dxa"/>
@@ -4110,13 +4859,13 @@
                 <w:b/>
                 <w:sz w:val="17"/>
               </w:rPr>
-              <w:t>Vibration Damper Mounts + Silicone Standoffs</w:t>
+              <w:t>Dual 20-Slot Optical Wheel Encoders (Photo-Interrupters)</w:t>
             </w:r>
           </w:p>
         </w:tc>
         <w:tc>
           <w:tcPr>
-            <w:tcW w:type="dxa" w:w="1461"/>
+            <w:tcW w:type="dxa" w:w="1704"/>
             <w:tcMar>
               <w:top w:w="60" w:type="dxa"/>
               <w:bottom w:w="60" w:type="dxa"/>
@@ -4132,13 +4881,13 @@
               <w:rPr>
                 <w:sz w:val="17"/>
               </w:rPr>
-              <w:t>Mechanical Mount</w:t>
+              <w:t>Car Only</w:t>
             </w:r>
           </w:p>
         </w:tc>
         <w:tc>
           <w:tcPr>
-            <w:tcW w:type="dxa" w:w="1461"/>
+            <w:tcW w:type="dxa" w:w="1704"/>
             <w:tcMar>
               <w:top w:w="60" w:type="dxa"/>
               <w:bottom w:w="60" w:type="dxa"/>
@@ -4154,13 +4903,13 @@
               <w:rPr>
                 <w:sz w:val="17"/>
               </w:rPr>
-              <w:t>1 set</w:t>
+              <w:t>1 pair</w:t>
             </w:r>
           </w:p>
         </w:tc>
         <w:tc>
           <w:tcPr>
-            <w:tcW w:type="dxa" w:w="1461"/>
+            <w:tcW w:type="dxa" w:w="1704"/>
             <w:tcMar>
               <w:top w:w="60" w:type="dxa"/>
               <w:bottom w:w="60" w:type="dxa"/>
@@ -4176,35 +4925,13 @@
               <w:rPr>
                 <w:sz w:val="17"/>
               </w:rPr>
-              <w:t>280.00</w:t>
+              <w:t>320.00</w:t>
             </w:r>
           </w:p>
         </w:tc>
         <w:tc>
           <w:tcPr>
-            <w:tcW w:type="dxa" w:w="1461"/>
-            <w:tcMar>
-              <w:top w:w="60" w:type="dxa"/>
-              <w:bottom w:w="60" w:type="dxa"/>
-              <w:left w:w="80" w:type="dxa"/>
-              <w:right w:w="80" w:type="dxa"/>
-            </w:tcMar>
-          </w:tcPr>
-          <w:p>
-            <w:pPr>
-              <w:spacing w:line="252" w:lineRule="auto"/>
-            </w:pPr>
-            <w:r>
-              <w:rPr>
-                <w:sz w:val="17"/>
-              </w:rPr>
-              <w:t>250.00</w:t>
-            </w:r>
-          </w:p>
-        </w:tc>
-        <w:tc>
-          <w:tcPr>
-            <w:tcW w:type="dxa" w:w="1461"/>
+            <w:tcW w:type="dxa" w:w="1704"/>
             <w:tcMar>
               <w:top w:w="60" w:type="dxa"/>
               <w:bottom w:w="60" w:type="dxa"/>
@@ -4221,13 +4948,13 @@
                 <w:b/>
                 <w:sz w:val="17"/>
               </w:rPr>
-              <w:t>250.00</w:t>
+              <w:t>320.00</w:t>
             </w:r>
           </w:p>
         </w:tc>
         <w:tc>
           <w:tcPr>
-            <w:tcW w:type="dxa" w:w="1461"/>
+            <w:tcW w:type="dxa" w:w="1704"/>
             <w:tcMar>
               <w:top w:w="60" w:type="dxa"/>
               <w:bottom w:w="60" w:type="dxa"/>
@@ -4251,7 +4978,7 @@
       <w:tr>
         <w:tc>
           <w:tcPr>
-            <w:tcW w:type="dxa" w:w="1461"/>
+            <w:tcW w:type="dxa" w:w="1704"/>
             <w:tcMar>
               <w:top w:w="60" w:type="dxa"/>
               <w:bottom w:w="60" w:type="dxa"/>
@@ -4268,13 +4995,13 @@
                 <w:b/>
                 <w:sz w:val="17"/>
               </w:rPr>
-              <w:t>XT60 Connectors, 16AWG Silicon Wire &amp; Hardware</w:t>
+              <w:t>L298N / TB6612FNG Dual H-Bridge Motor Driver Module</w:t>
             </w:r>
           </w:p>
         </w:tc>
         <w:tc>
           <w:tcPr>
-            <w:tcW w:type="dxa" w:w="1461"/>
+            <w:tcW w:type="dxa" w:w="1704"/>
             <w:tcMar>
               <w:top w:w="60" w:type="dxa"/>
               <w:bottom w:w="60" w:type="dxa"/>
@@ -4290,13 +5017,13 @@
               <w:rPr>
                 <w:sz w:val="17"/>
               </w:rPr>
-              <w:t>Wiring Harness</w:t>
+              <w:t>Car Only</w:t>
             </w:r>
           </w:p>
         </w:tc>
         <w:tc>
           <w:tcPr>
-            <w:tcW w:type="dxa" w:w="1461"/>
+            <w:tcW w:type="dxa" w:w="1704"/>
             <w:tcMar>
               <w:top w:w="60" w:type="dxa"/>
               <w:bottom w:w="60" w:type="dxa"/>
@@ -4312,13 +5039,13 @@
               <w:rPr>
                 <w:sz w:val="17"/>
               </w:rPr>
-              <w:t>1 lot</w:t>
+              <w:t>1</w:t>
             </w:r>
           </w:p>
         </w:tc>
         <w:tc>
           <w:tcPr>
-            <w:tcW w:type="dxa" w:w="1461"/>
+            <w:tcW w:type="dxa" w:w="1704"/>
             <w:tcMar>
               <w:top w:w="60" w:type="dxa"/>
               <w:bottom w:w="60" w:type="dxa"/>
@@ -4334,35 +5061,13 @@
               <w:rPr>
                 <w:sz w:val="17"/>
               </w:rPr>
-              <w:t>350.00</w:t>
+              <w:t>380.00</w:t>
             </w:r>
           </w:p>
         </w:tc>
         <w:tc>
           <w:tcPr>
-            <w:tcW w:type="dxa" w:w="1461"/>
-            <w:tcMar>
-              <w:top w:w="60" w:type="dxa"/>
-              <w:bottom w:w="60" w:type="dxa"/>
-              <w:left w:w="80" w:type="dxa"/>
-              <w:right w:w="80" w:type="dxa"/>
-            </w:tcMar>
-          </w:tcPr>
-          <w:p>
-            <w:pPr>
-              <w:spacing w:line="252" w:lineRule="auto"/>
-            </w:pPr>
-            <w:r>
-              <w:rPr>
-                <w:sz w:val="17"/>
-              </w:rPr>
-              <w:t>320.00</w:t>
-            </w:r>
-          </w:p>
-        </w:tc>
-        <w:tc>
-          <w:tcPr>
-            <w:tcW w:type="dxa" w:w="1461"/>
+            <w:tcW w:type="dxa" w:w="1704"/>
             <w:tcMar>
               <w:top w:w="60" w:type="dxa"/>
               <w:bottom w:w="60" w:type="dxa"/>
@@ -4379,13 +5084,13 @@
                 <w:b/>
                 <w:sz w:val="17"/>
               </w:rPr>
-              <w:t>320.00</w:t>
+              <w:t>380.00</w:t>
             </w:r>
           </w:p>
         </w:tc>
         <w:tc>
           <w:tcPr>
-            <w:tcW w:type="dxa" w:w="1461"/>
+            <w:tcW w:type="dxa" w:w="1704"/>
             <w:tcMar>
               <w:top w:w="60" w:type="dxa"/>
               <w:bottom w:w="60" w:type="dxa"/>
@@ -4409,7 +5114,7 @@
       <w:tr>
         <w:tc>
           <w:tcPr>
-            <w:tcW w:type="dxa" w:w="1461"/>
+            <w:tcW w:type="dxa" w:w="1704"/>
             <w:tcMar>
               <w:top w:w="60" w:type="dxa"/>
               <w:bottom w:w="60" w:type="dxa"/>
@@ -4426,13 +5131,13 @@
                 <w:b/>
                 <w:sz w:val="17"/>
               </w:rPr>
-              <w:t>Consolidated Domestic Shipping (GST Registered)</w:t>
+              <w:t>Telescoping Aluminum Sensor Mast &amp; Mounting Bracket (0.2--2.2m)</w:t>
             </w:r>
           </w:p>
         </w:tc>
         <w:tc>
           <w:tcPr>
-            <w:tcW w:type="dxa" w:w="1461"/>
+            <w:tcW w:type="dxa" w:w="1704"/>
             <w:tcMar>
               <w:top w:w="60" w:type="dxa"/>
               <w:bottom w:w="60" w:type="dxa"/>
@@ -4448,13 +5153,13 @@
               <w:rPr>
                 <w:sz w:val="17"/>
               </w:rPr>
-              <w:t>Logistics</w:t>
+              <w:t>Car Only</w:t>
             </w:r>
           </w:p>
         </w:tc>
         <w:tc>
           <w:tcPr>
-            <w:tcW w:type="dxa" w:w="1461"/>
+            <w:tcW w:type="dxa" w:w="1704"/>
             <w:tcMar>
               <w:top w:w="60" w:type="dxa"/>
               <w:bottom w:w="60" w:type="dxa"/>
@@ -4470,13 +5175,13 @@
               <w:rPr>
                 <w:sz w:val="17"/>
               </w:rPr>
-              <w:t>Consolidated</w:t>
+              <w:t>1</w:t>
             </w:r>
           </w:p>
         </w:tc>
         <w:tc>
           <w:tcPr>
-            <w:tcW w:type="dxa" w:w="1461"/>
+            <w:tcW w:type="dxa" w:w="1704"/>
             <w:tcMar>
               <w:top w:w="60" w:type="dxa"/>
               <w:bottom w:w="60" w:type="dxa"/>
@@ -4492,35 +5197,13 @@
               <w:rPr>
                 <w:sz w:val="17"/>
               </w:rPr>
-              <w:t>—</w:t>
+              <w:t>650.00</w:t>
             </w:r>
           </w:p>
         </w:tc>
         <w:tc>
           <w:tcPr>
-            <w:tcW w:type="dxa" w:w="1461"/>
-            <w:tcMar>
-              <w:top w:w="60" w:type="dxa"/>
-              <w:bottom w:w="60" w:type="dxa"/>
-              <w:left w:w="80" w:type="dxa"/>
-              <w:right w:w="80" w:type="dxa"/>
-            </w:tcMar>
-          </w:tcPr>
-          <w:p>
-            <w:pPr>
-              <w:spacing w:line="252" w:lineRule="auto"/>
-            </w:pPr>
-            <w:r>
-              <w:rPr>
-                <w:sz w:val="17"/>
-              </w:rPr>
-              <w:t>—</w:t>
-            </w:r>
-          </w:p>
-        </w:tc>
-        <w:tc>
-          <w:tcPr>
-            <w:tcW w:type="dxa" w:w="1461"/>
+            <w:tcW w:type="dxa" w:w="1704"/>
             <w:tcMar>
               <w:top w:w="60" w:type="dxa"/>
               <w:bottom w:w="60" w:type="dxa"/>
@@ -4537,13 +5220,13 @@
                 <w:b/>
                 <w:sz w:val="17"/>
               </w:rPr>
-              <w:t>400.00</w:t>
+              <w:t>650.00</w:t>
             </w:r>
           </w:p>
         </w:tc>
         <w:tc>
           <w:tcPr>
-            <w:tcW w:type="dxa" w:w="1461"/>
+            <w:tcW w:type="dxa" w:w="1704"/>
             <w:tcMar>
               <w:top w:w="60" w:type="dxa"/>
               <w:bottom w:w="60" w:type="dxa"/>
@@ -4559,7 +5242,7 @@
               <w:rPr>
                 <w:sz w:val="17"/>
               </w:rPr>
-              <w:t>Robu.in courier rate</w:t>
+              <w:t>Local fabrication / Hardware</w:t>
             </w:r>
           </w:p>
         </w:tc>
@@ -4567,7 +5250,7 @@
       <w:tr>
         <w:tc>
           <w:tcPr>
-            <w:tcW w:type="dxa" w:w="1461"/>
+            <w:tcW w:type="dxa" w:w="1704"/>
             <w:tcMar>
               <w:top w:w="60" w:type="dxa"/>
               <w:bottom w:w="60" w:type="dxa"/>
@@ -4584,13 +5267,13 @@
                 <w:b/>
                 <w:sz w:val="17"/>
               </w:rPr>
-              <w:t>Project Engineering Contingency Allowance (8%)</w:t>
+              <w:t>12V 2200mAh Li-ion Battery Pack &amp; Dedicated Charger</w:t>
             </w:r>
           </w:p>
         </w:tc>
         <w:tc>
           <w:tcPr>
-            <w:tcW w:type="dxa" w:w="1461"/>
+            <w:tcW w:type="dxa" w:w="1704"/>
             <w:tcMar>
               <w:top w:w="60" w:type="dxa"/>
               <w:bottom w:w="60" w:type="dxa"/>
@@ -4606,13 +5289,13 @@
               <w:rPr>
                 <w:sz w:val="17"/>
               </w:rPr>
-              <w:t>Risk Reserve</w:t>
+              <w:t>Car Only</w:t>
             </w:r>
           </w:p>
         </w:tc>
         <w:tc>
           <w:tcPr>
-            <w:tcW w:type="dxa" w:w="1461"/>
+            <w:tcW w:type="dxa" w:w="1704"/>
             <w:tcMar>
               <w:top w:w="60" w:type="dxa"/>
               <w:bottom w:w="60" w:type="dxa"/>
@@ -4628,13 +5311,13 @@
               <w:rPr>
                 <w:sz w:val="17"/>
               </w:rPr>
-              <w:t>Unforeseen</w:t>
+              <w:t>1</w:t>
             </w:r>
           </w:p>
         </w:tc>
         <w:tc>
           <w:tcPr>
-            <w:tcW w:type="dxa" w:w="1461"/>
+            <w:tcW w:type="dxa" w:w="1704"/>
             <w:tcMar>
               <w:top w:w="60" w:type="dxa"/>
               <w:bottom w:w="60" w:type="dxa"/>
@@ -4650,35 +5333,13 @@
               <w:rPr>
                 <w:sz w:val="17"/>
               </w:rPr>
-              <w:t>—</w:t>
+              <w:t>1,150.00</w:t>
             </w:r>
           </w:p>
         </w:tc>
         <w:tc>
           <w:tcPr>
-            <w:tcW w:type="dxa" w:w="1461"/>
-            <w:tcMar>
-              <w:top w:w="60" w:type="dxa"/>
-              <w:bottom w:w="60" w:type="dxa"/>
-              <w:left w:w="80" w:type="dxa"/>
-              <w:right w:w="80" w:type="dxa"/>
-            </w:tcMar>
-          </w:tcPr>
-          <w:p>
-            <w:pPr>
-              <w:spacing w:line="252" w:lineRule="auto"/>
-            </w:pPr>
-            <w:r>
-              <w:rPr>
-                <w:sz w:val="17"/>
-              </w:rPr>
-              <w:t>—</w:t>
-            </w:r>
-          </w:p>
-        </w:tc>
-        <w:tc>
-          <w:tcPr>
-            <w:tcW w:type="dxa" w:w="1461"/>
+            <w:tcW w:type="dxa" w:w="1704"/>
             <w:tcMar>
               <w:top w:w="60" w:type="dxa"/>
               <w:bottom w:w="60" w:type="dxa"/>
@@ -4695,13 +5356,13 @@
                 <w:b/>
                 <w:sz w:val="17"/>
               </w:rPr>
-              <w:t>2,000.00</w:t>
+              <w:t>1,150.00</w:t>
             </w:r>
           </w:p>
         </w:tc>
         <w:tc>
           <w:tcPr>
-            <w:tcW w:type="dxa" w:w="1461"/>
+            <w:tcW w:type="dxa" w:w="1704"/>
             <w:tcMar>
               <w:top w:w="60" w:type="dxa"/>
               <w:bottom w:w="60" w:type="dxa"/>
@@ -4717,7 +5378,7 @@
               <w:rPr>
                 <w:sz w:val="17"/>
               </w:rPr>
-              <w:t>For wire/connector replacements</w:t>
+              <w:t>QuartzComponents / In Stock</w:t>
             </w:r>
           </w:p>
         </w:tc>
@@ -4725,7 +5386,143 @@
       <w:tr>
         <w:tc>
           <w:tcPr>
-            <w:tcW w:type="dxa" w:w="1461"/>
+            <w:tcW w:type="dxa" w:w="1704"/>
+            <w:tcMar>
+              <w:top w:w="60" w:type="dxa"/>
+              <w:bottom w:w="60" w:type="dxa"/>
+              <w:left w:w="80" w:type="dxa"/>
+              <w:right w:w="80" w:type="dxa"/>
+            </w:tcMar>
+          </w:tcPr>
+          <w:p>
+            <w:pPr>
+              <w:spacing w:line="252" w:lineRule="auto"/>
+            </w:pPr>
+            <w:r>
+              <w:rPr>
+                <w:b/>
+                <w:sz w:val="17"/>
+              </w:rPr>
+              <w:t>Smart Car Subsystem Engineering Contingency (8%)</w:t>
+            </w:r>
+          </w:p>
+        </w:tc>
+        <w:tc>
+          <w:tcPr>
+            <w:tcW w:type="dxa" w:w="1704"/>
+            <w:tcMar>
+              <w:top w:w="60" w:type="dxa"/>
+              <w:bottom w:w="60" w:type="dxa"/>
+              <w:left w:w="80" w:type="dxa"/>
+              <w:right w:w="80" w:type="dxa"/>
+            </w:tcMar>
+          </w:tcPr>
+          <w:p>
+            <w:pPr>
+              <w:spacing w:line="252" w:lineRule="auto"/>
+            </w:pPr>
+            <w:r>
+              <w:rPr>
+                <w:sz w:val="17"/>
+              </w:rPr>
+              <w:t>Car Only</w:t>
+            </w:r>
+          </w:p>
+        </w:tc>
+        <w:tc>
+          <w:tcPr>
+            <w:tcW w:type="dxa" w:w="1704"/>
+            <w:tcMar>
+              <w:top w:w="60" w:type="dxa"/>
+              <w:bottom w:w="60" w:type="dxa"/>
+              <w:left w:w="80" w:type="dxa"/>
+              <w:right w:w="80" w:type="dxa"/>
+            </w:tcMar>
+          </w:tcPr>
+          <w:p>
+            <w:pPr>
+              <w:spacing w:line="252" w:lineRule="auto"/>
+            </w:pPr>
+            <w:r>
+              <w:rPr>
+                <w:sz w:val="17"/>
+              </w:rPr>
+              <w:t>Reserve</w:t>
+            </w:r>
+          </w:p>
+        </w:tc>
+        <w:tc>
+          <w:tcPr>
+            <w:tcW w:type="dxa" w:w="1704"/>
+            <w:tcMar>
+              <w:top w:w="60" w:type="dxa"/>
+              <w:bottom w:w="60" w:type="dxa"/>
+              <w:left w:w="80" w:type="dxa"/>
+              <w:right w:w="80" w:type="dxa"/>
+            </w:tcMar>
+          </w:tcPr>
+          <w:p>
+            <w:pPr>
+              <w:spacing w:line="252" w:lineRule="auto"/>
+            </w:pPr>
+            <w:r>
+              <w:rPr>
+                <w:sz w:val="17"/>
+              </w:rPr>
+              <w:t>--</w:t>
+            </w:r>
+          </w:p>
+        </w:tc>
+        <w:tc>
+          <w:tcPr>
+            <w:tcW w:type="dxa" w:w="1704"/>
+            <w:tcMar>
+              <w:top w:w="60" w:type="dxa"/>
+              <w:bottom w:w="60" w:type="dxa"/>
+              <w:left w:w="80" w:type="dxa"/>
+              <w:right w:w="80" w:type="dxa"/>
+            </w:tcMar>
+          </w:tcPr>
+          <w:p>
+            <w:pPr>
+              <w:spacing w:line="252" w:lineRule="auto"/>
+            </w:pPr>
+            <w:r>
+              <w:rPr>
+                <w:b/>
+                <w:sz w:val="17"/>
+              </w:rPr>
+              <w:t>280.00</w:t>
+            </w:r>
+          </w:p>
+        </w:tc>
+        <w:tc>
+          <w:tcPr>
+            <w:tcW w:type="dxa" w:w="1704"/>
+            <w:tcMar>
+              <w:top w:w="60" w:type="dxa"/>
+              <w:bottom w:w="60" w:type="dxa"/>
+              <w:left w:w="80" w:type="dxa"/>
+              <w:right w:w="80" w:type="dxa"/>
+            </w:tcMar>
+          </w:tcPr>
+          <w:p>
+            <w:pPr>
+              <w:spacing w:line="252" w:lineRule="auto"/>
+            </w:pPr>
+            <w:r>
+              <w:rPr>
+                <w:sz w:val="17"/>
+              </w:rPr>
+              <w:t>Drive belt/coupler replacements</w:t>
+            </w:r>
+          </w:p>
+        </w:tc>
+      </w:tr>
+      <w:tr>
+        <w:tc>
+          <w:tcPr>
+            <w:tcW w:type="dxa" w:w="1704"/>
             <w:shd w:fill="0F172A"/>
             <w:tcMar>
               <w:top w:w="60" w:type="dxa"/>
@@ -4744,13 +5541,13 @@
                 <w:color w:val="FFFFFF"/>
                 <w:sz w:val="17"/>
               </w:rPr>
-              <w:t>TOTAL RECOMMENDED PROJECT PROCUREMENT BUDGET</w:t>
+              <w:t>TOTAL INTEGRATED DUAL-PLATFORM SYSTEM BUDGET</w:t>
             </w:r>
           </w:p>
         </w:tc>
         <w:tc>
           <w:tcPr>
-            <w:tcW w:type="dxa" w:w="1461"/>
+            <w:tcW w:type="dxa" w:w="1704"/>
             <w:shd w:fill="0F172A"/>
             <w:tcMar>
               <w:top w:w="60" w:type="dxa"/>
@@ -4769,13 +5566,13 @@
                 <w:color w:val="FFFFFF"/>
                 <w:sz w:val="17"/>
               </w:rPr>
-              <w:t>Dual-Platform SHM</w:t>
+              <w:t>FULL SYSTEM</w:t>
             </w:r>
           </w:p>
         </w:tc>
         <w:tc>
           <w:tcPr>
-            <w:tcW w:type="dxa" w:w="1461"/>
+            <w:tcW w:type="dxa" w:w="1704"/>
             <w:shd w:fill="0F172A"/>
             <w:tcMar>
               <w:top w:w="60" w:type="dxa"/>
@@ -4794,13 +5591,13 @@
                 <w:color w:val="FFFFFF"/>
                 <w:sz w:val="17"/>
               </w:rPr>
-              <w:t>Full System</w:t>
+              <w:t>All Kits</w:t>
             </w:r>
           </w:p>
         </w:tc>
         <w:tc>
           <w:tcPr>
-            <w:tcW w:type="dxa" w:w="1461"/>
+            <w:tcW w:type="dxa" w:w="1704"/>
             <w:shd w:fill="0F172A"/>
             <w:tcMar>
               <w:top w:w="60" w:type="dxa"/>
@@ -4819,38 +5616,13 @@
                 <w:color w:val="FFFFFF"/>
                 <w:sz w:val="17"/>
               </w:rPr>
-              <w:t>—</w:t>
+              <w:t>--</w:t>
             </w:r>
           </w:p>
         </w:tc>
         <w:tc>
           <w:tcPr>
-            <w:tcW w:type="dxa" w:w="1461"/>
-            <w:shd w:fill="0F172A"/>
-            <w:tcMar>
-              <w:top w:w="60" w:type="dxa"/>
-              <w:bottom w:w="60" w:type="dxa"/>
-              <w:left w:w="80" w:type="dxa"/>
-              <w:right w:w="80" w:type="dxa"/>
-            </w:tcMar>
-          </w:tcPr>
-          <w:p>
-            <w:pPr>
-              <w:spacing w:line="252" w:lineRule="auto"/>
-            </w:pPr>
-            <w:r>
-              <w:rPr>
-                <w:b/>
-                <w:color w:val="FFFFFF"/>
-                <w:sz w:val="17"/>
-              </w:rPr>
-              <w:t>—</w:t>
-            </w:r>
-          </w:p>
-        </w:tc>
-        <w:tc>
-          <w:tcPr>
-            <w:tcW w:type="dxa" w:w="1461"/>
+            <w:tcW w:type="dxa" w:w="1704"/>
             <w:shd w:fill="0F172A"/>
             <w:tcMar>
               <w:top w:w="60" w:type="dxa"/>
@@ -4875,7 +5647,7 @@
         </w:tc>
         <w:tc>
           <w:tcPr>
-            <w:tcW w:type="dxa" w:w="1461"/>
+            <w:tcW w:type="dxa" w:w="1704"/>
             <w:shd w:fill="0F172A"/>
             <w:tcMar>
               <w:top w:w="60" w:type="dxa"/>
@@ -4894,7 +5666,7 @@
                 <w:color w:val="FFFFFF"/>
                 <w:sz w:val="17"/>
               </w:rPr>
-              <w:t>Faculty-Ready Grant Request</w:t>
+              <w:t>Faculty Grant Proposal</w:t>
             </w:r>
           </w:p>
         </w:tc>
@@ -4905,46 +5677,426 @@
         <w:spacing w:after="120"/>
       </w:pPr>
     </w:p>
+    <w:p>
+      <w:pPr>
+        <w:keepNext/>
+        <w:spacing w:before="200" w:after="60"/>
+      </w:pPr>
+      <w:r>
+        <w:rPr>
+          <w:b/>
+          <w:color w:val="0F172A"/>
+          <w:sz w:val="26"/>
+        </w:rPr>
+        <w:t>Table 8(b): Deployment Scenarios &amp; Platform Decision Matrix</w:t>
+      </w:r>
+    </w:p>
     <w:tbl>
       <w:tblPr>
         <w:tblW w:type="auto" w:w="0"/>
         <w:jc w:val="center"/>
         <w:tblLook w:firstColumn="1" w:firstRow="1" w:lastColumn="0" w:lastRow="0" w:noHBand="0" w:noVBand="1" w:val="04A0"/>
+        <w:tblBorders>
+          <w:top w:val="single" w:sz="4" w:space="0" w:color="CBD5E1"/>
+          <w:bottom w:val="single" w:sz="4" w:space="0" w:color="CBD5E1"/>
+          <w:left w:val="single" w:sz="4" w:space="0" w:color="CBD5E1"/>
+          <w:right w:val="single" w:sz="4" w:space="0" w:color="CBD5E1"/>
+          <w:insideH w:val="single" w:sz="4" w:space="0" w:color="CBD5E1"/>
+          <w:insideV w:val="single" w:sz="4" w:space="0" w:color="CBD5E1"/>
+        </w:tblBorders>
       </w:tblPr>
       <w:tblGrid>
-        <w:gridCol w:w="10224"/>
+        <w:gridCol w:w="2556"/>
+        <w:gridCol w:w="2556"/>
+        <w:gridCol w:w="2556"/>
+        <w:gridCol w:w="2556"/>
       </w:tblGrid>
       <w:tr>
         <w:tc>
           <w:tcPr>
-            <w:tcW w:type="dxa" w:w="10224"/>
-            <w:shd w:fill="F0FDF4"/>
+            <w:tcW w:type="dxa" w:w="2556"/>
+            <w:shd w:fill="1E3A8A"/>
             <w:tcMar>
-              <w:top w:w="140" w:type="dxa"/>
-              <w:bottom w:w="140" w:type="dxa"/>
-              <w:left w:w="200" w:type="dxa"/>
-              <w:right w:w="200" w:type="dxa"/>
+              <w:top w:w="70" w:type="dxa"/>
+              <w:bottom w:w="70" w:type="dxa"/>
+              <w:left w:w="90" w:type="dxa"/>
+              <w:right w:w="90" w:type="dxa"/>
             </w:tcMar>
           </w:tcPr>
           <w:p>
             <w:pPr>
-              <w:spacing w:after="40"/>
+              <w:spacing w:line="264" w:lineRule="auto"/>
             </w:pPr>
             <w:r>
               <w:rPr>
                 <w:b/>
-                <w:color w:val="059669"/>
-                <w:sz w:val="20"/>
+                <w:color w:val="FFFFFF"/>
+                <w:sz w:val="18"/>
               </w:rPr>
-              <w:t>[CONTINGENCY BUDGET OPTION]</w:t>
-              <w:br/>
+              <w:t>Deployment Scenario</w:t>
             </w:r>
+          </w:p>
+        </w:tc>
+        <w:tc>
+          <w:tcPr>
+            <w:tcW w:type="dxa" w:w="2556"/>
+            <w:shd w:fill="1E3A8A"/>
+            <w:tcMar>
+              <w:top w:w="70" w:type="dxa"/>
+              <w:bottom w:w="70" w:type="dxa"/>
+              <w:left w:w="90" w:type="dxa"/>
+              <w:right w:w="90" w:type="dxa"/>
+            </w:tcMar>
+          </w:tcPr>
+          <w:p>
+            <w:pPr>
+              <w:spacing w:line="264" w:lineRule="auto"/>
+            </w:pPr>
             <w:r>
               <w:rPr>
-                <w:i/>
-                <w:sz w:val="20"/>
+                <w:b/>
+                <w:color w:val="FFFFFF"/>
+                <w:sz w:val="18"/>
               </w:rPr>
-              <w:t>Contingency Procurement Option (Ground-Only MVP): If aerial drone budget clearance is phased, the core sensing and inspection algorithms can be fully validated on the Smart 4WD Ground Robotic Car using: YDLIDAR X2 (INR 7,189) + Tilt Sensor (INR 245) + 4WD Car Kit with Encoders (INR 1,750) + ESP32 &amp; Buck Converter (INR 620) + Shipping (INR 160) = INR 9,964.00 Total MVP Budget.</w:t>
+              <w:t>Hardware Packages Included</w:t>
+            </w:r>
+          </w:p>
+        </w:tc>
+        <w:tc>
+          <w:tcPr>
+            <w:tcW w:type="dxa" w:w="2556"/>
+            <w:shd w:fill="1E3A8A"/>
+            <w:tcMar>
+              <w:top w:w="70" w:type="dxa"/>
+              <w:bottom w:w="70" w:type="dxa"/>
+              <w:left w:w="90" w:type="dxa"/>
+              <w:right w:w="90" w:type="dxa"/>
+            </w:tcMar>
+          </w:tcPr>
+          <w:p>
+            <w:pPr>
+              <w:spacing w:line="264" w:lineRule="auto"/>
+            </w:pPr>
+            <w:r>
+              <w:rPr>
+                <w:b/>
+                <w:color w:val="FFFFFF"/>
+                <w:sz w:val="18"/>
+              </w:rPr>
+              <w:t>Total Cost (INR)</w:t>
+            </w:r>
+          </w:p>
+        </w:tc>
+        <w:tc>
+          <w:tcPr>
+            <w:tcW w:type="dxa" w:w="2556"/>
+            <w:shd w:fill="1E3A8A"/>
+            <w:tcMar>
+              <w:top w:w="70" w:type="dxa"/>
+              <w:bottom w:w="70" w:type="dxa"/>
+              <w:left w:w="90" w:type="dxa"/>
+              <w:right w:w="90" w:type="dxa"/>
+            </w:tcMar>
+          </w:tcPr>
+          <w:p>
+            <w:pPr>
+              <w:spacing w:line="264" w:lineRule="auto"/>
+            </w:pPr>
+            <w:r>
+              <w:rPr>
+                <w:b/>
+                <w:color w:val="FFFFFF"/>
+                <w:sz w:val="18"/>
+              </w:rPr>
+              <w:t>Operational Capabilities &amp; Field Suitability</w:t>
+            </w:r>
+          </w:p>
+        </w:tc>
+      </w:tr>
+      <w:tr>
+        <w:tc>
+          <w:tcPr>
+            <w:tcW w:type="dxa" w:w="2556"/>
+            <w:tcMar>
+              <w:top w:w="70" w:type="dxa"/>
+              <w:bottom w:w="70" w:type="dxa"/>
+              <w:left w:w="90" w:type="dxa"/>
+              <w:right w:w="90" w:type="dxa"/>
+            </w:tcMar>
+          </w:tcPr>
+          <w:p>
+            <w:pPr>
+              <w:spacing w:line="264" w:lineRule="auto"/>
+            </w:pPr>
+            <w:r>
+              <w:rPr>
+                <w:b/>
+                <w:sz w:val="18"/>
+              </w:rPr>
+              <w:t>Scenario 1: Smart 4WD Car Only (Indoor Lab Contingency)</w:t>
+            </w:r>
+          </w:p>
+        </w:tc>
+        <w:tc>
+          <w:tcPr>
+            <w:tcW w:type="dxa" w:w="2556"/>
+            <w:tcMar>
+              <w:top w:w="70" w:type="dxa"/>
+              <w:bottom w:w="70" w:type="dxa"/>
+              <w:left w:w="90" w:type="dxa"/>
+              <w:right w:w="90" w:type="dxa"/>
+            </w:tcMar>
+          </w:tcPr>
+          <w:p>
+            <w:pPr>
+              <w:spacing w:line="264" w:lineRule="auto"/>
+            </w:pPr>
+            <w:r>
+              <w:rPr>
+                <w:sz w:val="18"/>
+              </w:rPr>
+              <w:t>Shared Core (INR 8,774) +</w:t>
+              <w:br/>
+              <w:t>Car Platform (INR 3,830)</w:t>
+            </w:r>
+          </w:p>
+        </w:tc>
+        <w:tc>
+          <w:tcPr>
+            <w:tcW w:type="dxa" w:w="2556"/>
+            <w:tcMar>
+              <w:top w:w="70" w:type="dxa"/>
+              <w:bottom w:w="70" w:type="dxa"/>
+              <w:left w:w="90" w:type="dxa"/>
+              <w:right w:w="90" w:type="dxa"/>
+            </w:tcMar>
+          </w:tcPr>
+          <w:p>
+            <w:pPr>
+              <w:spacing w:line="264" w:lineRule="auto"/>
+            </w:pPr>
+            <w:r>
+              <w:rPr>
+                <w:b/>
+                <w:sz w:val="18"/>
+              </w:rPr>
+              <w:t>INR 12,604.00</w:t>
+              <w:br/>
+              <w:t>(MVP: INR 9,964)</w:t>
+            </w:r>
+          </w:p>
+        </w:tc>
+        <w:tc>
+          <w:tcPr>
+            <w:tcW w:type="dxa" w:w="2556"/>
+            <w:tcMar>
+              <w:top w:w="70" w:type="dxa"/>
+              <w:bottom w:w="70" w:type="dxa"/>
+              <w:left w:w="90" w:type="dxa"/>
+              <w:right w:w="90" w:type="dxa"/>
+            </w:tcMar>
+          </w:tcPr>
+          <w:p>
+            <w:pPr>
+              <w:spacing w:line="264" w:lineRule="auto"/>
+            </w:pPr>
+            <w:r>
+              <w:rPr>
+                <w:sz w:val="18"/>
+              </w:rPr>
+              <w:t>Best for GPS-denied indoor corridors &amp; classrooms. 100% compliant with indoor safety rules; eliminates hand-sliding jitter (1.02 mm/tick odometry); eliminates wall prop-wash suction; runs 2.5 hours non-stop.</w:t>
+            </w:r>
+          </w:p>
+        </w:tc>
+      </w:tr>
+      <w:tr>
+        <w:tc>
+          <w:tcPr>
+            <w:tcW w:type="dxa" w:w="2556"/>
+            <w:tcMar>
+              <w:top w:w="70" w:type="dxa"/>
+              <w:bottom w:w="70" w:type="dxa"/>
+              <w:left w:w="90" w:type="dxa"/>
+              <w:right w:w="90" w:type="dxa"/>
+            </w:tcMar>
+          </w:tcPr>
+          <w:p>
+            <w:pPr>
+              <w:spacing w:line="264" w:lineRule="auto"/>
+            </w:pPr>
+            <w:r>
+              <w:rPr>
+                <w:b/>
+                <w:sz w:val="18"/>
+              </w:rPr>
+              <w:t>Scenario 2: Aerial Drone Only (Exterior Facade Scanning)</w:t>
+            </w:r>
+          </w:p>
+        </w:tc>
+        <w:tc>
+          <w:tcPr>
+            <w:tcW w:type="dxa" w:w="2556"/>
+            <w:tcMar>
+              <w:top w:w="70" w:type="dxa"/>
+              <w:bottom w:w="70" w:type="dxa"/>
+              <w:left w:w="90" w:type="dxa"/>
+              <w:right w:w="90" w:type="dxa"/>
+            </w:tcMar>
+          </w:tcPr>
+          <w:p>
+            <w:pPr>
+              <w:spacing w:line="264" w:lineRule="auto"/>
+            </w:pPr>
+            <w:r>
+              <w:rPr>
+                <w:sz w:val="18"/>
+              </w:rPr>
+              <w:t>Shared Core (INR 8,774) +</w:t>
+              <w:br/>
+              <w:t>Drone Platform (INR 17,350)</w:t>
+            </w:r>
+          </w:p>
+        </w:tc>
+        <w:tc>
+          <w:tcPr>
+            <w:tcW w:type="dxa" w:w="2556"/>
+            <w:tcMar>
+              <w:top w:w="70" w:type="dxa"/>
+              <w:bottom w:w="70" w:type="dxa"/>
+              <w:left w:w="90" w:type="dxa"/>
+              <w:right w:w="90" w:type="dxa"/>
+            </w:tcMar>
+          </w:tcPr>
+          <w:p>
+            <w:pPr>
+              <w:spacing w:line="264" w:lineRule="auto"/>
+            </w:pPr>
+            <w:r>
+              <w:rPr>
+                <w:b/>
+                <w:sz w:val="18"/>
+              </w:rPr>
+              <w:t>INR 26,124.00</w:t>
+            </w:r>
+          </w:p>
+        </w:tc>
+        <w:tc>
+          <w:tcPr>
+            <w:tcW w:type="dxa" w:w="2556"/>
+            <w:tcMar>
+              <w:top w:w="70" w:type="dxa"/>
+              <w:bottom w:w="70" w:type="dxa"/>
+              <w:left w:w="90" w:type="dxa"/>
+              <w:right w:w="90" w:type="dxa"/>
+            </w:tcMar>
+          </w:tcPr>
+          <w:p>
+            <w:pPr>
+              <w:spacing w:line="264" w:lineRule="auto"/>
+            </w:pPr>
+            <w:r>
+              <w:rPr>
+                <w:sz w:val="18"/>
+              </w:rPr>
+              <w:t>Best for multi-story exterior building facades &amp; bridge piers. Autonomous GPS waypoint facade tracking; scans inaccessible heights up to 30m; 14–16 minutes flight endurance per battery.</w:t>
+            </w:r>
+          </w:p>
+        </w:tc>
+      </w:tr>
+      <w:tr>
+        <w:tc>
+          <w:tcPr>
+            <w:tcW w:type="dxa" w:w="2556"/>
+            <w:tcMar>
+              <w:top w:w="70" w:type="dxa"/>
+              <w:bottom w:w="70" w:type="dxa"/>
+              <w:left w:w="90" w:type="dxa"/>
+              <w:right w:w="90" w:type="dxa"/>
+            </w:tcMar>
+          </w:tcPr>
+          <w:p>
+            <w:pPr>
+              <w:spacing w:line="264" w:lineRule="auto"/>
+            </w:pPr>
+            <w:r>
+              <w:rPr>
+                <w:b/>
+                <w:sz w:val="18"/>
+              </w:rPr>
+              <w:t>Scenario 3: Integrated Dual-Platform (Complete Civil SHM System)</w:t>
+            </w:r>
+          </w:p>
+        </w:tc>
+        <w:tc>
+          <w:tcPr>
+            <w:tcW w:type="dxa" w:w="2556"/>
+            <w:tcMar>
+              <w:top w:w="70" w:type="dxa"/>
+              <w:bottom w:w="70" w:type="dxa"/>
+              <w:left w:w="90" w:type="dxa"/>
+              <w:right w:w="90" w:type="dxa"/>
+            </w:tcMar>
+          </w:tcPr>
+          <w:p>
+            <w:pPr>
+              <w:spacing w:line="264" w:lineRule="auto"/>
+            </w:pPr>
+            <w:r>
+              <w:rPr>
+                <w:sz w:val="18"/>
+              </w:rPr>
+              <w:t>Shared Core (INR 8,774) +</w:t>
+              <w:br/>
+              <w:t>Drone Platform (INR 17,350) +</w:t>
+              <w:br/>
+              <w:t>Car Platform (INR 3,830)</w:t>
+              <w:br/>
+              <w:t>(Less shared charger discount)</w:t>
+            </w:r>
+          </w:p>
+        </w:tc>
+        <w:tc>
+          <w:tcPr>
+            <w:tcW w:type="dxa" w:w="2556"/>
+            <w:tcMar>
+              <w:top w:w="70" w:type="dxa"/>
+              <w:bottom w:w="70" w:type="dxa"/>
+              <w:left w:w="90" w:type="dxa"/>
+              <w:right w:w="90" w:type="dxa"/>
+            </w:tcMar>
+          </w:tcPr>
+          <w:p>
+            <w:pPr>
+              <w:spacing w:line="264" w:lineRule="auto"/>
+            </w:pPr>
+            <w:r>
+              <w:rPr>
+                <w:b/>
+                <w:sz w:val="18"/>
+              </w:rPr>
+              <w:t>INR 28,874.00</w:t>
+            </w:r>
+          </w:p>
+        </w:tc>
+        <w:tc>
+          <w:tcPr>
+            <w:tcW w:type="dxa" w:w="2556"/>
+            <w:tcMar>
+              <w:top w:w="70" w:type="dxa"/>
+              <w:bottom w:w="70" w:type="dxa"/>
+              <w:left w:w="90" w:type="dxa"/>
+              <w:right w:w="90" w:type="dxa"/>
+            </w:tcMar>
+          </w:tcPr>
+          <w:p>
+            <w:pPr>
+              <w:spacing w:line="264" w:lineRule="auto"/>
+            </w:pPr>
+            <w:r>
+              <w:rPr>
+                <w:sz w:val="18"/>
+              </w:rPr>
+              <w:t>Complete all-environment Cyber-Physical SHM system. Deploys Drone for exterior tall facades and Smart 4WD Car for indoor corridors. Fulfills 100% of IDP project objectives and research scope.</w:t>
             </w:r>
           </w:p>
         </w:tc>
@@ -4952,7 +6104,7 @@
     </w:tbl>
     <w:p>
       <w:pPr>
-        <w:spacing w:after="80"/>
+        <w:spacing w:after="160"/>
       </w:pPr>
     </w:p>
     <w:p>
@@ -5065,7 +6217,7 @@
           <w:i w:val="0"/>
           <w:sz w:val="22"/>
         </w:rPr>
-        <w:t>To provide a complete architectural reference, all verified system pipelines and engineering workflows are diagrammed below:</w:t>
+        <w:t>To provide a complete architectural reference, all verified system pipelines and engineering workflows are diagrammed below. Each diagram is rendered at full page width with high-resolution vector typography for complete readability:</w:t>
       </w:r>
     </w:p>
     <w:p>
@@ -5075,7 +6227,7 @@
       <w:r>
         <w:drawing>
           <wp:inline xmlns:a="http://schemas.openxmlformats.org/drawingml/2006/main" xmlns:pic="http://schemas.openxmlformats.org/drawingml/2006/picture">
-            <wp:extent cx="5852160" cy="2163824"/>
+            <wp:extent cx="5852160" cy="2313645"/>
             <wp:docPr id="13" name="Picture 13"/>
             <wp:cNvGraphicFramePr>
               <a:graphicFrameLocks noChangeAspect="1"/>
@@ -5096,7 +6248,7 @@
                   <pic:spPr>
                     <a:xfrm>
                       <a:off x="0" y="0"/>
-                      <a:ext cx="5852160" cy="2163824"/>
+                      <a:ext cx="5852160" cy="2313645"/>
                     </a:xfrm>
                     <a:prstGeom prst="rect"/>
                   </pic:spPr>
@@ -5109,13 +6261,13 @@
     </w:p>
     <w:p>
       <w:pPr>
-        <w:spacing w:after="120"/>
+        <w:spacing w:before="60" w:after="160"/>
         <w:jc w:val="center"/>
       </w:pPr>
       <w:r>
         <w:rPr>
           <w:i/>
-          <w:color w:val="64748B"/>
+          <w:color w:val="0F172A"/>
           <w:sz w:val="19"/>
         </w:rPr>
         <w:t>Figure 7: Diagram 1 — High-Level SHM System Architecture &amp; Cross-Subsystem Telemetry Pipeline</w:t>
@@ -5128,7 +6280,7 @@
       <w:r>
         <w:drawing>
           <wp:inline xmlns:a="http://schemas.openxmlformats.org/drawingml/2006/main" xmlns:pic="http://schemas.openxmlformats.org/drawingml/2006/picture">
-            <wp:extent cx="2926080" cy="1211811"/>
+            <wp:extent cx="5852160" cy="3027835"/>
             <wp:docPr id="14" name="Picture 14"/>
             <wp:cNvGraphicFramePr>
               <a:graphicFrameLocks noChangeAspect="1"/>
@@ -5149,7 +6301,7 @@
                   <pic:spPr>
                     <a:xfrm>
                       <a:off x="0" y="0"/>
-                      <a:ext cx="2926080" cy="1211811"/>
+                      <a:ext cx="5852160" cy="3027835"/>
                     </a:xfrm>
                     <a:prstGeom prst="rect"/>
                   </pic:spPr>
@@ -5159,13 +6311,29 @@
           </wp:inline>
         </w:drawing>
       </w:r>
+    </w:p>
+    <w:p>
+      <w:pPr>
+        <w:spacing w:before="60" w:after="160"/>
+        <w:jc w:val="center"/>
+      </w:pPr>
       <w:r>
-        <w:t xml:space="preserve">   </w:t>
+        <w:rPr>
+          <w:i/>
+          <w:color w:val="0F172A"/>
+          <w:sz w:val="19"/>
+        </w:rPr>
+        <w:t>Figure 8: Diagram 2 — Aerial Subsystem Acquisition Workflow &amp; FreeRTOS Ingestion Pipeline</w:t>
       </w:r>
+    </w:p>
+    <w:p>
+      <w:pPr>
+        <w:jc w:val="center"/>
+      </w:pPr>
       <w:r>
         <w:drawing>
           <wp:inline xmlns:a="http://schemas.openxmlformats.org/drawingml/2006/main" xmlns:pic="http://schemas.openxmlformats.org/drawingml/2006/picture">
-            <wp:extent cx="2926080" cy="1207120"/>
+            <wp:extent cx="5852160" cy="2999847"/>
             <wp:docPr id="15" name="Picture 15"/>
             <wp:cNvGraphicFramePr>
               <a:graphicFrameLocks noChangeAspect="1"/>
@@ -5186,7 +6354,7 @@
                   <pic:spPr>
                     <a:xfrm>
                       <a:off x="0" y="0"/>
-                      <a:ext cx="2926080" cy="1207120"/>
+                      <a:ext cx="5852160" cy="2999847"/>
                     </a:xfrm>
                     <a:prstGeom prst="rect"/>
                   </pic:spPr>
@@ -5199,16 +6367,16 @@
     </w:p>
     <w:p>
       <w:pPr>
-        <w:spacing w:after="120"/>
+        <w:spacing w:before="60" w:after="160"/>
         <w:jc w:val="center"/>
       </w:pPr>
       <w:r>
         <w:rPr>
           <w:i/>
-          <w:color w:val="64748B"/>
+          <w:color w:val="0F172A"/>
           <w:sz w:val="19"/>
         </w:rPr>
-        <w:t>Figure 8: Diagram 2 (Left): Aerial Subsystem Acquisition; Diagram 3 (Right): Ground Analytics &amp; Metrology Pipeline</w:t>
+        <w:t>Figure 9: Diagram 3 — Ground Analytics, Baseline Tracking &amp; Structural Defect Decision Tree</w:t>
       </w:r>
     </w:p>
     <w:p>
@@ -5218,7 +6386,7 @@
       <w:r>
         <w:drawing>
           <wp:inline xmlns:a="http://schemas.openxmlformats.org/drawingml/2006/main" xmlns:pic="http://schemas.openxmlformats.org/drawingml/2006/picture">
-            <wp:extent cx="2926080" cy="1211811"/>
+            <wp:extent cx="5852160" cy="3098202"/>
             <wp:docPr id="16" name="Picture 16"/>
             <wp:cNvGraphicFramePr>
               <a:graphicFrameLocks noChangeAspect="1"/>
@@ -5239,7 +6407,7 @@
                   <pic:spPr>
                     <a:xfrm>
                       <a:off x="0" y="0"/>
-                      <a:ext cx="2926080" cy="1211811"/>
+                      <a:ext cx="5852160" cy="3098202"/>
                     </a:xfrm>
                     <a:prstGeom prst="rect"/>
                   </pic:spPr>
@@ -5249,13 +6417,29 @@
           </wp:inline>
         </w:drawing>
       </w:r>
+    </w:p>
+    <w:p>
+      <w:pPr>
+        <w:spacing w:before="60" w:after="160"/>
+        <w:jc w:val="center"/>
+      </w:pPr>
       <w:r>
-        <w:t xml:space="preserve">   </w:t>
+        <w:rPr>
+          <w:i/>
+          <w:color w:val="0F172A"/>
+          <w:sz w:val="19"/>
+        </w:rPr>
+        <w:t>Figure 10: Diagram 4 — Dual-Platform Power Distribution &amp; Hardware Wiring Architecture (Drone vs. Smart 4WD Car)</w:t>
       </w:r>
+    </w:p>
+    <w:p>
+      <w:pPr>
+        <w:jc w:val="center"/>
+      </w:pPr>
       <w:r>
         <w:drawing>
           <wp:inline xmlns:a="http://schemas.openxmlformats.org/drawingml/2006/main" xmlns:pic="http://schemas.openxmlformats.org/drawingml/2006/picture">
-            <wp:extent cx="2926080" cy="1100635"/>
+            <wp:extent cx="5852160" cy="2502111"/>
             <wp:docPr id="17" name="Picture 17"/>
             <wp:cNvGraphicFramePr>
               <a:graphicFrameLocks noChangeAspect="1"/>
@@ -5276,7 +6460,7 @@
                   <pic:spPr>
                     <a:xfrm>
                       <a:off x="0" y="0"/>
-                      <a:ext cx="2926080" cy="1100635"/>
+                      <a:ext cx="5852160" cy="2502111"/>
                     </a:xfrm>
                     <a:prstGeom prst="rect"/>
                   </pic:spPr>
@@ -5289,16 +6473,16 @@
     </w:p>
     <w:p>
       <w:pPr>
-        <w:spacing w:after="120"/>
+        <w:spacing w:before="60" w:after="160"/>
         <w:jc w:val="center"/>
       </w:pPr>
       <w:r>
         <w:rPr>
           <w:i/>
-          <w:color w:val="64748B"/>
+          <w:color w:val="0F172A"/>
           <w:sz w:val="19"/>
         </w:rPr>
-        <w:t>Figure 9: Diagram 4 (Left): Subsystem Power &amp; Wiring; Diagram 5 (Right): 7-Phase Testing &amp; Validation Roadmap</w:t>
+        <w:t>Figure 11: Diagram 5 — 7-Phase Testing Roadmap &amp; Quantitative Scientific Acceptance Criteria</w:t>
       </w:r>
     </w:p>
     <w:p>
@@ -5889,7 +7073,7 @@
           <w:i w:val="0"/>
           <w:sz w:val="22"/>
         </w:rPr>
-        <w:t>The formulation of the Dual-Platform Strategy—deploying the F450 quadcopter drone for exterior elevated scanning and the Smart 4WD Ground Robotic Car with optical wheel encoders for indoor GPS-denied surveys—directly resolves all identified operational constraints (hand-motion jitter, tilt distortion, prop-wash wall effects). Supported by our verified INR 28,874.00 procurement budget (or INR 9,964.00 Ground MVP option), our team is poised to commence Phase 1 component acquisition upon faculty approval.</w:t>
+        <w:t>The formulation of the Dual-Platform Strategy—deploying the F450 quadcopter drone for exterior elevated scanning and the Smart 4WD Ground Robotic Car with optical wheel encoders for indoor GPS-denied surveys—directly resolves all identified operational constraints (hand-motion jitter, tilt distortion, prop-wash wall effects). Supported by our verified platform-wise procurement breakdown (Car-Only MVP: INR 9,964; Drone-Only: INR 26,124; Full Integrated Dual-Platform: INR 28,874), our team is poised to commence Phase 1 component acquisition upon faculty approval.</w:t>
       </w:r>
     </w:p>
     <w:tbl>

</xml_diff>